<commit_message>
minor user guide edits
</commit_message>
<xml_diff>
--- a/User_Guide.docx
+++ b/User_Guide.docx
@@ -96,18 +96,9 @@
           <w:lang w:val="en-US"/>
           <w14:ligatures w14:val="none"/>
         </w:rPr>
-        <w:t>1.2</w:t>
-      </w:r>
-    </w:p>
-    <w:p>
-      <w:pPr>
-        <w:pStyle w:val="Subtitle"/>
-        <w:numPr>
-          <w:ilvl w:val="0"/>
-          <w:numId w:val="0"/>
-        </w:numPr>
-        <w:spacing w:after="200" w:line="276" w:lineRule="auto"/>
-        <w:divId w:val="860977169"/>
+        <w:t>1.</w:t>
+      </w:r>
+      <w:r>
         <w:rPr>
           <w:i/>
           <w:iCs/>
@@ -118,8 +109,18 @@
           <w:lang w:val="en-US"/>
           <w14:ligatures w14:val="none"/>
         </w:rPr>
-      </w:pPr>
-      <w:r>
+        <w:t>3</w:t>
+      </w:r>
+    </w:p>
+    <w:p>
+      <w:pPr>
+        <w:pStyle w:val="Subtitle"/>
+        <w:numPr>
+          <w:ilvl w:val="0"/>
+          <w:numId w:val="0"/>
+        </w:numPr>
+        <w:spacing w:after="200" w:line="276" w:lineRule="auto"/>
+        <w:divId w:val="860977169"/>
         <w:rPr>
           <w:i/>
           <w:iCs/>
@@ -130,8 +131,7 @@
           <w:lang w:val="en-US"/>
           <w14:ligatures w14:val="none"/>
         </w:rPr>
-        <w:t xml:space="preserve">Version of the </w:t>
-      </w:r>
+      </w:pPr>
       <w:r>
         <w:rPr>
           <w:i/>
@@ -143,7 +143,7 @@
           <w:lang w:val="en-US"/>
           <w14:ligatures w14:val="none"/>
         </w:rPr>
-        <w:t xml:space="preserve">publicly available </w:t>
+        <w:t xml:space="preserve">Version of the </w:t>
       </w:r>
       <w:r>
         <w:rPr>
@@ -156,7 +156,7 @@
           <w:lang w:val="en-US"/>
           <w14:ligatures w14:val="none"/>
         </w:rPr>
-        <w:t xml:space="preserve">model:  </w:t>
+        <w:t xml:space="preserve">publicly available </w:t>
       </w:r>
       <w:r>
         <w:rPr>
@@ -169,18 +169,9 @@
           <w:lang w:val="en-US"/>
           <w14:ligatures w14:val="none"/>
         </w:rPr>
-        <w:t>V1.0</w:t>
-      </w:r>
-    </w:p>
-    <w:p>
-      <w:pPr>
-        <w:pStyle w:val="Subtitle"/>
-        <w:numPr>
-          <w:ilvl w:val="0"/>
-          <w:numId w:val="0"/>
-        </w:numPr>
-        <w:spacing w:after="200" w:line="276" w:lineRule="auto"/>
-        <w:divId w:val="860977169"/>
+        <w:t xml:space="preserve">model:  </w:t>
+      </w:r>
+      <w:r>
         <w:rPr>
           <w:i/>
           <w:iCs/>
@@ -191,8 +182,18 @@
           <w:lang w:val="en-US"/>
           <w14:ligatures w14:val="none"/>
         </w:rPr>
-      </w:pPr>
-      <w:r>
+        <w:t>V1.0</w:t>
+      </w:r>
+    </w:p>
+    <w:p>
+      <w:pPr>
+        <w:pStyle w:val="Subtitle"/>
+        <w:numPr>
+          <w:ilvl w:val="0"/>
+          <w:numId w:val="0"/>
+        </w:numPr>
+        <w:spacing w:after="200" w:line="276" w:lineRule="auto"/>
+        <w:divId w:val="860977169"/>
         <w:rPr>
           <w:i/>
           <w:iCs/>
@@ -203,8 +204,7 @@
           <w:lang w:val="en-US"/>
           <w14:ligatures w14:val="none"/>
         </w:rPr>
-        <w:t xml:space="preserve">Version of R: </w:t>
-      </w:r>
+      </w:pPr>
       <w:r>
         <w:rPr>
           <w:i/>
@@ -216,7 +216,48 @@
           <w:lang w:val="en-US"/>
           <w14:ligatures w14:val="none"/>
         </w:rPr>
-        <w:t>R version 4.5.1 (2025-06-13 ucrt) -- "Great Square Root". Copyright (C) 2025 The R Foundation for Statistical Computing</w:t>
+        <w:t xml:space="preserve">Version of R: </w:t>
+      </w:r>
+      <w:r>
+        <w:rPr>
+          <w:i/>
+          <w:iCs/>
+          <w:color w:val="074F6A" w:themeColor="accent4" w:themeShade="80"/>
+          <w:kern w:val="0"/>
+          <w:sz w:val="24"/>
+          <w:szCs w:val="24"/>
+          <w:lang w:val="en-US"/>
+          <w14:ligatures w14:val="none"/>
+        </w:rPr>
+        <w:t xml:space="preserve">R version 4.5.1 (2025-06-13 </w:t>
+      </w:r>
+      <w:proofErr w:type="spellStart"/>
+      <w:r>
+        <w:rPr>
+          <w:i/>
+          <w:iCs/>
+          <w:color w:val="074F6A" w:themeColor="accent4" w:themeShade="80"/>
+          <w:kern w:val="0"/>
+          <w:sz w:val="24"/>
+          <w:szCs w:val="24"/>
+          <w:lang w:val="en-US"/>
+          <w14:ligatures w14:val="none"/>
+        </w:rPr>
+        <w:t>ucrt</w:t>
+      </w:r>
+      <w:proofErr w:type="spellEnd"/>
+      <w:r>
+        <w:rPr>
+          <w:i/>
+          <w:iCs/>
+          <w:color w:val="074F6A" w:themeColor="accent4" w:themeShade="80"/>
+          <w:kern w:val="0"/>
+          <w:sz w:val="24"/>
+          <w:szCs w:val="24"/>
+          <w:lang w:val="en-US"/>
+          <w14:ligatures w14:val="none"/>
+        </w:rPr>
+        <w:t>) -- "Great Square Root". Copyright (C) 2025 The R Foundation for Statistical Computing</w:t>
       </w:r>
     </w:p>
     <w:p>
@@ -1461,7 +1502,15 @@
         <w:t xml:space="preserve">To download the R project, </w:t>
       </w:r>
       <w:r>
-        <w:t xml:space="preserve">you can link to Github via SSH or </w:t>
+        <w:t xml:space="preserve">you can link to </w:t>
+      </w:r>
+      <w:proofErr w:type="spellStart"/>
+      <w:r>
+        <w:t>Github</w:t>
+      </w:r>
+      <w:proofErr w:type="spellEnd"/>
+      <w:r>
+        <w:t xml:space="preserve"> via SSH or </w:t>
       </w:r>
       <w:r>
         <w:t>download the whole project as a zip folder by clicking on the “&lt;&gt;Code” button in the right hand corner:</w:t>
@@ -1692,7 +1741,23 @@
         <w:divId w:val="860977169"/>
       </w:pPr>
       <w:r>
-        <w:t xml:space="preserve">Required packages include: ggplot2, data.table, parallel, assertthat (these are downloaded within the model script below so don’t worry you don’t need to do anything yet about this). </w:t>
+        <w:t xml:space="preserve">Required packages include: ggplot2, </w:t>
+      </w:r>
+      <w:proofErr w:type="spellStart"/>
+      <w:r>
+        <w:t>data.table</w:t>
+      </w:r>
+      <w:proofErr w:type="spellEnd"/>
+      <w:r>
+        <w:t xml:space="preserve">, parallel, </w:t>
+      </w:r>
+      <w:proofErr w:type="spellStart"/>
+      <w:r>
+        <w:t>assertthat</w:t>
+      </w:r>
+      <w:proofErr w:type="spellEnd"/>
+      <w:r>
+        <w:t xml:space="preserve"> (these are downloaded within the model script below so don’t worry you don’t need to do anything yet about this). </w:t>
       </w:r>
     </w:p>
     <w:p>
@@ -3128,8 +3193,42 @@
           <w:color w:val="000000"/>
           <w:szCs w:val="32"/>
         </w:rPr>
-        <w:t>outputs/base_case_results.RData → contains an object base_case</w:t>
-      </w:r>
+        <w:t>outputs/</w:t>
+      </w:r>
+      <w:proofErr w:type="spellStart"/>
+      <w:r>
+        <w:rPr>
+          <w:rFonts w:eastAsia="Times New Roman" w:cs="Segoe UI"/>
+          <w:i w:val="0"/>
+          <w:iCs w:val="0"/>
+          <w:color w:val="000000"/>
+          <w:szCs w:val="32"/>
+        </w:rPr>
+        <w:t>base_case_results.RData</w:t>
+      </w:r>
+      <w:proofErr w:type="spellEnd"/>
+      <w:r>
+        <w:rPr>
+          <w:rFonts w:eastAsia="Times New Roman" w:cs="Segoe UI"/>
+          <w:i w:val="0"/>
+          <w:iCs w:val="0"/>
+          <w:color w:val="000000"/>
+          <w:szCs w:val="32"/>
+        </w:rPr>
+        <w:t xml:space="preserve"> → contains an object </w:t>
+      </w:r>
+      <w:proofErr w:type="spellStart"/>
+      <w:r>
+        <w:rPr>
+          <w:rFonts w:eastAsia="Times New Roman" w:cs="Segoe UI"/>
+          <w:i w:val="0"/>
+          <w:iCs w:val="0"/>
+          <w:color w:val="000000"/>
+          <w:szCs w:val="32"/>
+        </w:rPr>
+        <w:t>base_case</w:t>
+      </w:r>
+      <w:proofErr w:type="spellEnd"/>
     </w:p>
     <w:p>
       <w:pPr>
@@ -3161,7 +3260,51 @@
           <w:color w:val="000000"/>
           <w:szCs w:val="32"/>
         </w:rPr>
-        <w:t>outputs/network_results.RData → contains a named list network_results (names = ISDNs)</w:t>
+        <w:t>outputs/</w:t>
+      </w:r>
+      <w:proofErr w:type="spellStart"/>
+      <w:r>
+        <w:rPr>
+          <w:rFonts w:eastAsia="Times New Roman" w:cs="Segoe UI"/>
+          <w:i w:val="0"/>
+          <w:iCs w:val="0"/>
+          <w:color w:val="000000"/>
+          <w:szCs w:val="32"/>
+        </w:rPr>
+        <w:t>network_results.RData</w:t>
+      </w:r>
+      <w:proofErr w:type="spellEnd"/>
+      <w:r>
+        <w:rPr>
+          <w:rFonts w:eastAsia="Times New Roman" w:cs="Segoe UI"/>
+          <w:i w:val="0"/>
+          <w:iCs w:val="0"/>
+          <w:color w:val="000000"/>
+          <w:szCs w:val="32"/>
+        </w:rPr>
+        <w:t xml:space="preserve"> → contains a named list </w:t>
+      </w:r>
+      <w:proofErr w:type="spellStart"/>
+      <w:r>
+        <w:rPr>
+          <w:rFonts w:eastAsia="Times New Roman" w:cs="Segoe UI"/>
+          <w:i w:val="0"/>
+          <w:iCs w:val="0"/>
+          <w:color w:val="000000"/>
+          <w:szCs w:val="32"/>
+        </w:rPr>
+        <w:t>network_results</w:t>
+      </w:r>
+      <w:proofErr w:type="spellEnd"/>
+      <w:r>
+        <w:rPr>
+          <w:rFonts w:eastAsia="Times New Roman" w:cs="Segoe UI"/>
+          <w:i w:val="0"/>
+          <w:iCs w:val="0"/>
+          <w:color w:val="000000"/>
+          <w:szCs w:val="32"/>
+        </w:rPr>
+        <w:t xml:space="preserve"> (names = ISDNs)</w:t>
       </w:r>
     </w:p>
     <w:p>
@@ -3194,7 +3337,51 @@
           <w:color w:val="000000"/>
           <w:szCs w:val="32"/>
         </w:rPr>
-        <w:t>outputs/hospital_results.RData → contains a named list hospital_results (names = Hospitals)</w:t>
+        <w:t>outputs/</w:t>
+      </w:r>
+      <w:proofErr w:type="spellStart"/>
+      <w:r>
+        <w:rPr>
+          <w:rFonts w:eastAsia="Times New Roman" w:cs="Segoe UI"/>
+          <w:i w:val="0"/>
+          <w:iCs w:val="0"/>
+          <w:color w:val="000000"/>
+          <w:szCs w:val="32"/>
+        </w:rPr>
+        <w:t>hospital_results.RData</w:t>
+      </w:r>
+      <w:proofErr w:type="spellEnd"/>
+      <w:r>
+        <w:rPr>
+          <w:rFonts w:eastAsia="Times New Roman" w:cs="Segoe UI"/>
+          <w:i w:val="0"/>
+          <w:iCs w:val="0"/>
+          <w:color w:val="000000"/>
+          <w:szCs w:val="32"/>
+        </w:rPr>
+        <w:t xml:space="preserve"> → contains a named list </w:t>
+      </w:r>
+      <w:proofErr w:type="spellStart"/>
+      <w:r>
+        <w:rPr>
+          <w:rFonts w:eastAsia="Times New Roman" w:cs="Segoe UI"/>
+          <w:i w:val="0"/>
+          <w:iCs w:val="0"/>
+          <w:color w:val="000000"/>
+          <w:szCs w:val="32"/>
+        </w:rPr>
+        <w:t>hospital_results</w:t>
+      </w:r>
+      <w:proofErr w:type="spellEnd"/>
+      <w:r>
+        <w:rPr>
+          <w:rFonts w:eastAsia="Times New Roman" w:cs="Segoe UI"/>
+          <w:i w:val="0"/>
+          <w:iCs w:val="0"/>
+          <w:color w:val="000000"/>
+          <w:szCs w:val="32"/>
+        </w:rPr>
+        <w:t xml:space="preserve"> (names = Hospitals)</w:t>
       </w:r>
     </w:p>
     <w:p>
@@ -3284,6 +3471,7 @@
           <w:color w:val="auto"/>
         </w:rPr>
       </w:pPr>
+      <w:proofErr w:type="spellStart"/>
       <w:r>
         <w:rPr>
           <w:i w:val="0"/>
@@ -3291,8 +3479,9 @@
           <w:color w:val="auto"/>
           <w:highlight w:val="lightGray"/>
         </w:rPr>
-        <w:t>install.packages(c("rmarkdown", "knitr", "htmltools"</w:t>
-      </w:r>
+        <w:t>install.packages</w:t>
+      </w:r>
+      <w:proofErr w:type="spellEnd"/>
       <w:r>
         <w:rPr>
           <w:i w:val="0"/>
@@ -3300,8 +3489,9 @@
           <w:color w:val="auto"/>
           <w:highlight w:val="lightGray"/>
         </w:rPr>
-        <w:t>,”</w:t>
-      </w:r>
+        <w:t>(c("</w:t>
+      </w:r>
+      <w:proofErr w:type="spellStart"/>
       <w:r>
         <w:rPr>
           <w:i w:val="0"/>
@@ -3309,7 +3499,95 @@
           <w:color w:val="auto"/>
           <w:highlight w:val="lightGray"/>
         </w:rPr>
-        <w:t>"kableExtra")</w:t>
+        <w:t>rmarkdown</w:t>
+      </w:r>
+      <w:proofErr w:type="spellEnd"/>
+      <w:r>
+        <w:rPr>
+          <w:i w:val="0"/>
+          <w:iCs w:val="0"/>
+          <w:color w:val="auto"/>
+          <w:highlight w:val="lightGray"/>
+        </w:rPr>
+        <w:t>", "</w:t>
+      </w:r>
+      <w:proofErr w:type="spellStart"/>
+      <w:r>
+        <w:rPr>
+          <w:i w:val="0"/>
+          <w:iCs w:val="0"/>
+          <w:color w:val="auto"/>
+          <w:highlight w:val="lightGray"/>
+        </w:rPr>
+        <w:t>knitr</w:t>
+      </w:r>
+      <w:proofErr w:type="spellEnd"/>
+      <w:r>
+        <w:rPr>
+          <w:i w:val="0"/>
+          <w:iCs w:val="0"/>
+          <w:color w:val="auto"/>
+          <w:highlight w:val="lightGray"/>
+        </w:rPr>
+        <w:t>", "</w:t>
+      </w:r>
+      <w:proofErr w:type="spellStart"/>
+      <w:r>
+        <w:rPr>
+          <w:i w:val="0"/>
+          <w:iCs w:val="0"/>
+          <w:color w:val="auto"/>
+          <w:highlight w:val="lightGray"/>
+        </w:rPr>
+        <w:t>htmltools</w:t>
+      </w:r>
+      <w:proofErr w:type="spellEnd"/>
+      <w:r>
+        <w:rPr>
+          <w:i w:val="0"/>
+          <w:iCs w:val="0"/>
+          <w:color w:val="auto"/>
+          <w:highlight w:val="lightGray"/>
+        </w:rPr>
+        <w:t>"</w:t>
+      </w:r>
+      <w:r>
+        <w:rPr>
+          <w:i w:val="0"/>
+          <w:iCs w:val="0"/>
+          <w:color w:val="auto"/>
+          <w:highlight w:val="lightGray"/>
+        </w:rPr>
+        <w:t>,”</w:t>
+      </w:r>
+      <w:r>
+        <w:rPr>
+          <w:i w:val="0"/>
+          <w:iCs w:val="0"/>
+          <w:color w:val="auto"/>
+          <w:highlight w:val="lightGray"/>
+        </w:rPr>
+        <w:t>"</w:t>
+      </w:r>
+      <w:proofErr w:type="spellStart"/>
+      <w:r>
+        <w:rPr>
+          <w:i w:val="0"/>
+          <w:iCs w:val="0"/>
+          <w:color w:val="auto"/>
+          <w:highlight w:val="lightGray"/>
+        </w:rPr>
+        <w:t>kableExtra</w:t>
+      </w:r>
+      <w:proofErr w:type="spellEnd"/>
+      <w:r>
+        <w:rPr>
+          <w:i w:val="0"/>
+          <w:iCs w:val="0"/>
+          <w:color w:val="auto"/>
+          <w:highlight w:val="lightGray"/>
+        </w:rPr>
+        <w:t>")</w:t>
       </w:r>
       <w:r>
         <w:rPr>
@@ -3447,8 +3725,9 @@
           <w:color w:val="000000"/>
           <w:szCs w:val="32"/>
         </w:rPr>
-        <w:t>Open the R</w:t>
-      </w:r>
+        <w:t xml:space="preserve">Open the </w:t>
+      </w:r>
+      <w:proofErr w:type="spellStart"/>
       <w:r>
         <w:rPr>
           <w:rFonts w:eastAsia="Times New Roman" w:cs="Segoe UI"/>
@@ -3457,7 +3736,7 @@
           <w:color w:val="000000"/>
           <w:szCs w:val="32"/>
         </w:rPr>
-        <w:t>eport_</w:t>
+        <w:t>R</w:t>
       </w:r>
       <w:r>
         <w:rPr>
@@ -3467,7 +3746,7 @@
           <w:color w:val="000000"/>
           <w:szCs w:val="32"/>
         </w:rPr>
-        <w:t>Generation</w:t>
+        <w:t>eport_</w:t>
       </w:r>
       <w:r>
         <w:rPr>
@@ -3477,8 +3756,19 @@
           <w:color w:val="000000"/>
           <w:szCs w:val="32"/>
         </w:rPr>
+        <w:t>Generation</w:t>
+      </w:r>
+      <w:r>
+        <w:rPr>
+          <w:rFonts w:eastAsia="Times New Roman" w:cs="Segoe UI"/>
+          <w:i w:val="0"/>
+          <w:iCs w:val="0"/>
+          <w:color w:val="000000"/>
+          <w:szCs w:val="32"/>
+        </w:rPr>
         <w:t>.Rmd</w:t>
       </w:r>
+      <w:proofErr w:type="spellEnd"/>
     </w:p>
     <w:p>
       <w:pPr>
@@ -4103,7 +4393,15 @@
         <w:t>W</w:t>
       </w:r>
       <w:r>
-        <w:t xml:space="preserve">hen complete, the file will be automatically available for you to click and open within the Rproject folder. </w:t>
+        <w:t xml:space="preserve">hen complete, the file will be automatically available for you to click and open within the </w:t>
+      </w:r>
+      <w:proofErr w:type="spellStart"/>
+      <w:r>
+        <w:t>Rproject</w:t>
+      </w:r>
+      <w:proofErr w:type="spellEnd"/>
+      <w:r>
+        <w:t xml:space="preserve"> folder. </w:t>
       </w:r>
     </w:p>
     <w:p>
@@ -4129,8 +4427,13 @@
       <w:r>
         <w:t>needed .</w:t>
       </w:r>
-      <w:r>
-        <w:t>RData files exist in /outputs.</w:t>
+      <w:proofErr w:type="spellStart"/>
+      <w:r>
+        <w:t>RData</w:t>
+      </w:r>
+      <w:proofErr w:type="spellEnd"/>
+      <w:r>
+        <w:t xml:space="preserve"> files exist in /outputs.</w:t>
       </w:r>
     </w:p>
     <w:p>
@@ -4150,9 +4453,11 @@
       <w:r>
         <w:t>The package “</w:t>
       </w:r>
+      <w:proofErr w:type="spellStart"/>
       <w:r>
         <w:t>RTools</w:t>
       </w:r>
+      <w:proofErr w:type="spellEnd"/>
       <w:r>
         <w:t>”</w:t>
       </w:r>
@@ -4163,7 +4468,15 @@
         <w:t xml:space="preserve">s to build packages from source (e.g., when </w:t>
       </w:r>
       <w:r>
-        <w:t>a precompiled binary isn’t available). For standard CRAN installs on Windows, R will use binaries and RTools is not typically required.</w:t>
+        <w:t xml:space="preserve">a precompiled binary isn’t available). For standard CRAN installs on Windows, R will use binaries and </w:t>
+      </w:r>
+      <w:proofErr w:type="spellStart"/>
+      <w:r>
+        <w:t>RTools</w:t>
+      </w:r>
+      <w:proofErr w:type="spellEnd"/>
+      <w:r>
+        <w:t xml:space="preserve"> is not typically required.</w:t>
       </w:r>
     </w:p>
     <w:p>
@@ -4341,11 +4654,89 @@
         <w:jc w:val="center"/>
         <w:divId w:val="860977169"/>
       </w:pPr>
+      <w:proofErr w:type="spellStart"/>
       <w:r>
         <w:rPr>
           <w:highlight w:val="lightGray"/>
         </w:rPr>
-        <w:t>install.packages(c(  "data.table", "tidyverse", "assertthat", "truncnorm", "conflicted", "scales", "reshape2",  "networkD3", "htmlwidgets"))</w:t>
+        <w:t>install.packages</w:t>
+      </w:r>
+      <w:proofErr w:type="spellEnd"/>
+      <w:r>
+        <w:rPr>
+          <w:highlight w:val="lightGray"/>
+        </w:rPr>
+        <w:t>(c(  "</w:t>
+      </w:r>
+      <w:proofErr w:type="spellStart"/>
+      <w:r>
+        <w:rPr>
+          <w:highlight w:val="lightGray"/>
+        </w:rPr>
+        <w:t>data.table</w:t>
+      </w:r>
+      <w:proofErr w:type="spellEnd"/>
+      <w:r>
+        <w:rPr>
+          <w:highlight w:val="lightGray"/>
+        </w:rPr>
+        <w:t>", "</w:t>
+      </w:r>
+      <w:proofErr w:type="spellStart"/>
+      <w:r>
+        <w:rPr>
+          <w:highlight w:val="lightGray"/>
+        </w:rPr>
+        <w:t>tidyverse</w:t>
+      </w:r>
+      <w:proofErr w:type="spellEnd"/>
+      <w:r>
+        <w:rPr>
+          <w:highlight w:val="lightGray"/>
+        </w:rPr>
+        <w:t>", "</w:t>
+      </w:r>
+      <w:proofErr w:type="spellStart"/>
+      <w:r>
+        <w:rPr>
+          <w:highlight w:val="lightGray"/>
+        </w:rPr>
+        <w:t>assertthat</w:t>
+      </w:r>
+      <w:proofErr w:type="spellEnd"/>
+      <w:r>
+        <w:rPr>
+          <w:highlight w:val="lightGray"/>
+        </w:rPr>
+        <w:t>", "</w:t>
+      </w:r>
+      <w:proofErr w:type="spellStart"/>
+      <w:r>
+        <w:rPr>
+          <w:highlight w:val="lightGray"/>
+        </w:rPr>
+        <w:t>truncnorm</w:t>
+      </w:r>
+      <w:proofErr w:type="spellEnd"/>
+      <w:r>
+        <w:rPr>
+          <w:highlight w:val="lightGray"/>
+        </w:rPr>
+        <w:t>", "conflicted", "scales", "reshape2",  "networkD3", "</w:t>
+      </w:r>
+      <w:proofErr w:type="spellStart"/>
+      <w:r>
+        <w:rPr>
+          <w:highlight w:val="lightGray"/>
+        </w:rPr>
+        <w:t>htmlwidgets</w:t>
+      </w:r>
+      <w:proofErr w:type="spellEnd"/>
+      <w:r>
+        <w:rPr>
+          <w:highlight w:val="lightGray"/>
+        </w:rPr>
+        <w:t>"))</w:t>
       </w:r>
     </w:p>
     <w:p>
@@ -4510,32 +4901,57 @@
             <w:r>
               <w:t xml:space="preserve"> </w:t>
             </w:r>
-            <w:r>
-              <w:t>model_param;</w:t>
+            <w:proofErr w:type="spellStart"/>
+            <w:r>
+              <w:t>model_param</w:t>
+            </w:r>
+            <w:proofErr w:type="spellEnd"/>
+            <w:r>
+              <w:t>;</w:t>
             </w:r>
             <w:r>
               <w:t xml:space="preserve"> </w:t>
             </w:r>
-            <w:r>
-              <w:t>base_case;</w:t>
+            <w:proofErr w:type="spellStart"/>
+            <w:r>
+              <w:t>base_case</w:t>
+            </w:r>
+            <w:proofErr w:type="spellEnd"/>
+            <w:r>
+              <w:t>;</w:t>
             </w:r>
             <w:r>
               <w:t xml:space="preserve"> </w:t>
             </w:r>
-            <w:r>
-              <w:t>PSA_distribution;</w:t>
+            <w:proofErr w:type="spellStart"/>
+            <w:r>
+              <w:t>PSA_distribution</w:t>
+            </w:r>
+            <w:proofErr w:type="spellEnd"/>
+            <w:r>
+              <w:t>;</w:t>
             </w:r>
             <w:r>
               <w:t xml:space="preserve"> </w:t>
             </w:r>
-            <w:r>
-              <w:t>PSA_low;</w:t>
+            <w:proofErr w:type="spellStart"/>
+            <w:r>
+              <w:t>PSA_low</w:t>
+            </w:r>
+            <w:proofErr w:type="spellEnd"/>
+            <w:r>
+              <w:t>;</w:t>
             </w:r>
             <w:r>
               <w:t xml:space="preserve"> </w:t>
             </w:r>
-            <w:r>
-              <w:t>PSA_high;</w:t>
+            <w:proofErr w:type="spellStart"/>
+            <w:r>
+              <w:t>PSA_high</w:t>
+            </w:r>
+            <w:proofErr w:type="spellEnd"/>
+            <w:r>
+              <w:t>;</w:t>
             </w:r>
             <w:r>
               <w:t xml:space="preserve"> </w:t>
@@ -4546,26 +4962,46 @@
             <w:r>
               <w:t xml:space="preserve"> </w:t>
             </w:r>
-            <w:r>
-              <w:t>DSA_flag;</w:t>
+            <w:proofErr w:type="spellStart"/>
+            <w:r>
+              <w:t>DSA_flag</w:t>
+            </w:r>
+            <w:proofErr w:type="spellEnd"/>
+            <w:r>
+              <w:t>;</w:t>
             </w:r>
             <w:r>
               <w:t xml:space="preserve"> </w:t>
             </w:r>
-            <w:r>
-              <w:t>DSA_low;</w:t>
+            <w:proofErr w:type="spellStart"/>
+            <w:r>
+              <w:t>DSA_low</w:t>
+            </w:r>
+            <w:proofErr w:type="spellEnd"/>
+            <w:r>
+              <w:t>;</w:t>
             </w:r>
             <w:r>
               <w:t xml:space="preserve"> </w:t>
             </w:r>
-            <w:r>
-              <w:t>DSA_high;</w:t>
+            <w:proofErr w:type="spellStart"/>
+            <w:r>
+              <w:t>DSA_high</w:t>
+            </w:r>
+            <w:proofErr w:type="spellEnd"/>
+            <w:r>
+              <w:t>;</w:t>
             </w:r>
             <w:r>
               <w:t xml:space="preserve"> </w:t>
             </w:r>
-            <w:r>
-              <w:t>mrs;</w:t>
+            <w:proofErr w:type="spellStart"/>
+            <w:r>
+              <w:t>mrs</w:t>
+            </w:r>
+            <w:proofErr w:type="spellEnd"/>
+            <w:r>
+              <w:t>;</w:t>
             </w:r>
             <w:r>
               <w:t xml:space="preserve"> </w:t>
@@ -4734,7 +5170,15 @@
           </w:tcPr>
           <w:p>
             <w:r>
-              <w:t>ISDN (integrated stroke network name, e.g. London), site.name (hospital site name, e.g. Barking, Havering and Redbridge University Hospitals NHS Trust), Hospital (e.g. Queens Hospital Romford HASU), date (date range for stroke recordings), n.stroke (number of strokes recorded at that hospital for the stated time frame)</w:t>
+              <w:t xml:space="preserve">ISDN (integrated stroke network name, e.g. London), site.name (hospital site name, e.g. Barking, Havering and Redbridge University Hospitals NHS Trust), Hospital (e.g. Queens Hospital Romford HASU), date (date range for stroke recordings), </w:t>
+            </w:r>
+            <w:proofErr w:type="spellStart"/>
+            <w:r>
+              <w:t>n.stroke</w:t>
+            </w:r>
+            <w:proofErr w:type="spellEnd"/>
+            <w:r>
+              <w:t xml:space="preserve"> (number of strokes recorded at that hospital for the stated time frame)</w:t>
             </w:r>
           </w:p>
         </w:tc>
@@ -4823,7 +5267,15 @@
         <w:divId w:val="860977169"/>
       </w:pPr>
       <w:r>
-        <w:t>These are the input csv files needed to run the model. These are used, by the model code, to create inputs which feed into the "created_inputs" subfolder.</w:t>
+        <w:t>These are the input csv files needed to run the model. These are used, by the model code, to create inputs which feed into the "</w:t>
+      </w:r>
+      <w:proofErr w:type="spellStart"/>
+      <w:r>
+        <w:t>created_inputs</w:t>
+      </w:r>
+      <w:proofErr w:type="spellEnd"/>
+      <w:r>
+        <w:t>" subfolder.</w:t>
       </w:r>
     </w:p>
     <w:p>
@@ -4944,8 +5396,13 @@
         </w:rPr>
         <w:t>─</w:t>
       </w:r>
-      <w:r>
-        <w:t xml:space="preserve"> Rscripts/</w:t>
+      <w:proofErr w:type="spellStart"/>
+      <w:r>
+        <w:t>model_code</w:t>
+      </w:r>
+      <w:proofErr w:type="spellEnd"/>
+      <w:r>
+        <w:t>/</w:t>
       </w:r>
     </w:p>
     <w:p>
@@ -4968,7 +5425,15 @@
         <w:t>─</w:t>
       </w:r>
       <w:r>
-        <w:t xml:space="preserve"> model_functions.R                 # core acute-tree + long-term Markov model</w:t>
+        <w:t xml:space="preserve"> </w:t>
+      </w:r>
+      <w:proofErr w:type="spellStart"/>
+      <w:r>
+        <w:t>model_functions.R</w:t>
+      </w:r>
+      <w:proofErr w:type="spellEnd"/>
+      <w:r>
+        <w:t xml:space="preserve">                 # core acute-tree + long-term Markov model</w:t>
       </w:r>
     </w:p>
     <w:p>
@@ -4991,7 +5456,15 @@
         <w:t>─</w:t>
       </w:r>
       <w:r>
-        <w:t xml:space="preserve"> model_functions_mortality_sc.R    # scenario variant (mortality RR year 1)</w:t>
+        <w:t xml:space="preserve"> </w:t>
+      </w:r>
+      <w:proofErr w:type="spellStart"/>
+      <w:r>
+        <w:t>model_functions_mortality_sc.R</w:t>
+      </w:r>
+      <w:proofErr w:type="spellEnd"/>
+      <w:r>
+        <w:t xml:space="preserve">    # scenario variant (mortality RR year 1)</w:t>
       </w:r>
     </w:p>
     <w:p>
@@ -5014,7 +5487,21 @@
         <w:t>─</w:t>
       </w:r>
       <w:r>
-        <w:t xml:space="preserve"> model_functions_MTTPA_sc.R        # scenario variant (additive LT effects)</w:t>
+        <w:t xml:space="preserve"> </w:t>
+      </w:r>
+      <w:proofErr w:type="spellStart"/>
+      <w:r>
+        <w:t>m</w:t>
+      </w:r>
+      <w:r>
+        <w:t>odel_functions_MTIVT_sc</w:t>
+      </w:r>
+      <w:r>
+        <w:t>.R</w:t>
+      </w:r>
+      <w:proofErr w:type="spellEnd"/>
+      <w:r>
+        <w:t xml:space="preserve">        # scenario variant (additive LT effects)</w:t>
       </w:r>
     </w:p>
     <w:p>
@@ -5203,8 +5690,13 @@
         <w:t>─</w:t>
       </w:r>
       <w:r>
-        <w:t xml:space="preserve"> regional_level.R</w:t>
-      </w:r>
+        <w:t xml:space="preserve"> </w:t>
+      </w:r>
+      <w:proofErr w:type="spellStart"/>
+      <w:r>
+        <w:t>regional_level.R</w:t>
+      </w:r>
+      <w:proofErr w:type="spellEnd"/>
       <w:r>
         <w:t xml:space="preserve">            # ISDN-level analysis</w:t>
       </w:r>
@@ -5231,9 +5723,11 @@
       <w:r>
         <w:t xml:space="preserve"> </w:t>
       </w:r>
+      <w:proofErr w:type="spellStart"/>
       <w:r>
         <w:t>local_level.R</w:t>
       </w:r>
+      <w:proofErr w:type="spellEnd"/>
       <w:r>
         <w:t xml:space="preserve">            # hospital-level analysis</w:t>
       </w:r>
@@ -5258,13 +5752,27 @@
         <w:rPr>
           <w:rFonts w:cs="Aptos"/>
         </w:rPr>
-        <w:t>─figure</w:t>
-      </w:r>
+        <w:t>─</w:t>
+      </w:r>
+      <w:proofErr w:type="spellStart"/>
       <w:r>
         <w:rPr>
           <w:rFonts w:cs="Aptos"/>
         </w:rPr>
-        <w:t>_creation/ [contains R scripts creating figures, no order/hierarchy to run these]</w:t>
+        <w:t>figure</w:t>
+      </w:r>
+      <w:r>
+        <w:rPr>
+          <w:rFonts w:cs="Aptos"/>
+        </w:rPr>
+        <w:t>_creation</w:t>
+      </w:r>
+      <w:proofErr w:type="spellEnd"/>
+      <w:r>
+        <w:rPr>
+          <w:rFonts w:cs="Aptos"/>
+        </w:rPr>
+        <w:t>/ [contains R scripts creating figures]</w:t>
       </w:r>
     </w:p>
     <w:p>
@@ -5424,7 +5932,15 @@
         <w:divId w:val="860977169"/>
       </w:pPr>
       <w:r>
-        <w:t>Dates: The ISDN datasets include a date label such as "Apr 2022–Mar 2023". Retain this exact format (month name plus year range, using a consistent en-dash or hyphen). If you use a different period label, update the filter in the script accordingly.</w:t>
+        <w:t xml:space="preserve">Dates: The ISDN datasets include a date label such as "Apr 2022–Mar 2023". Retain this exact format (month name plus year range, using a consistent </w:t>
+      </w:r>
+      <w:proofErr w:type="spellStart"/>
+      <w:r>
+        <w:t>en</w:t>
+      </w:r>
+      <w:proofErr w:type="spellEnd"/>
+      <w:r>
+        <w:t>-dash or hyphen). If you use a different period label, update the filter in the script accordingly.</w:t>
       </w:r>
     </w:p>
     <w:p>
@@ -5529,7 +6045,25 @@
         <w:divId w:val="860977169"/>
       </w:pPr>
       <w:r>
-        <w:t>Percent vs proportion: isdn_TPA_E.csv must contain percent values in p_etpa2tpa (e.g., 37.5, not 0.375). The script checks that the maximum value is greater than 1 as a sanity check and then divides by 100 when writing parameters.</w:t>
+        <w:t>Percent vs proportion: isdn_</w:t>
+      </w:r>
+      <w:r>
+        <w:t>ivt</w:t>
+      </w:r>
+      <w:r>
+        <w:t>.csv must contain percent values in p_e</w:t>
+      </w:r>
+      <w:r>
+        <w:t>ivt</w:t>
+      </w:r>
+      <w:r>
+        <w:t>2</w:t>
+      </w:r>
+      <w:r>
+        <w:t>ivt</w:t>
+      </w:r>
+      <w:r>
+        <w:t xml:space="preserve"> (e.g., 37.5, not 0.375). The script checks that the maximum value is greater than 1 as a sanity check and then divides by 100 when writing parameters.</w:t>
       </w:r>
     </w:p>
     <w:p>
@@ -5593,13 +6127,37 @@
         <w:t xml:space="preserve">Utilities (by mRS): truncated normal on [0,1] from mean </w:t>
       </w:r>
       <w:r>
-        <w:t xml:space="preserve">(base_case) </w:t>
+        <w:t>(</w:t>
+      </w:r>
+      <w:proofErr w:type="spellStart"/>
+      <w:r>
+        <w:t>base_case</w:t>
+      </w:r>
+      <w:proofErr w:type="spellEnd"/>
+      <w:r>
+        <w:t xml:space="preserve">) </w:t>
       </w:r>
       <w:r>
         <w:t>+ 95% CI</w:t>
       </w:r>
       <w:r>
-        <w:t xml:space="preserve"> (PSA_low and PSA_high)</w:t>
+        <w:t xml:space="preserve"> (</w:t>
+      </w:r>
+      <w:proofErr w:type="spellStart"/>
+      <w:r>
+        <w:t>PSA_low</w:t>
+      </w:r>
+      <w:proofErr w:type="spellEnd"/>
+      <w:r>
+        <w:t xml:space="preserve"> and </w:t>
+      </w:r>
+      <w:proofErr w:type="spellStart"/>
+      <w:r>
+        <w:t>PSA_high</w:t>
+      </w:r>
+      <w:proofErr w:type="spellEnd"/>
+      <w:r>
+        <w:t>)</w:t>
       </w:r>
     </w:p>
     <w:p>
@@ -5615,7 +6173,31 @@
         <w:t xml:space="preserve">Costs: gamma fit </w:t>
       </w:r>
       <w:r>
-        <w:t>from mean (base_case) + 95% CI (PSA_low and PSA_high)</w:t>
+        <w:t>from mean (</w:t>
+      </w:r>
+      <w:proofErr w:type="spellStart"/>
+      <w:r>
+        <w:t>base_case</w:t>
+      </w:r>
+      <w:proofErr w:type="spellEnd"/>
+      <w:r>
+        <w:t>) + 95% CI (</w:t>
+      </w:r>
+      <w:proofErr w:type="spellStart"/>
+      <w:r>
+        <w:t>PSA_low</w:t>
+      </w:r>
+      <w:proofErr w:type="spellEnd"/>
+      <w:r>
+        <w:t xml:space="preserve"> and </w:t>
+      </w:r>
+      <w:proofErr w:type="spellStart"/>
+      <w:r>
+        <w:t>PSA_high</w:t>
+      </w:r>
+      <w:proofErr w:type="spellEnd"/>
+      <w:r>
+        <w:t>)</w:t>
       </w:r>
     </w:p>
     <w:p>
@@ -5631,7 +6213,31 @@
         <w:t xml:space="preserve">RR mortality (by mRS): lognormal </w:t>
       </w:r>
       <w:r>
-        <w:t>from mean (base_case) + 95% CI (PSA_low and PSA_high)</w:t>
+        <w:t>from mean (</w:t>
+      </w:r>
+      <w:proofErr w:type="spellStart"/>
+      <w:r>
+        <w:t>base_case</w:t>
+      </w:r>
+      <w:proofErr w:type="spellEnd"/>
+      <w:r>
+        <w:t>) + 95% CI (</w:t>
+      </w:r>
+      <w:proofErr w:type="spellStart"/>
+      <w:r>
+        <w:t>PSA_low</w:t>
+      </w:r>
+      <w:proofErr w:type="spellEnd"/>
+      <w:r>
+        <w:t xml:space="preserve"> and </w:t>
+      </w:r>
+      <w:proofErr w:type="spellStart"/>
+      <w:r>
+        <w:t>PSA_high</w:t>
+      </w:r>
+      <w:proofErr w:type="spellEnd"/>
+      <w:r>
+        <w:t>)</w:t>
       </w:r>
     </w:p>
     <w:p>
@@ -5644,7 +6250,15 @@
         <w:divId w:val="860977169"/>
       </w:pPr>
       <w:r>
-        <w:t>Control probabilities: Beta(mean, k) — here k is stored in the parameter file under PSA_low for Beta rows (not a CI bound).</w:t>
+        <w:t xml:space="preserve">Control probabilities: Beta(mean, k) — here k is stored in the parameter file under </w:t>
+      </w:r>
+      <w:proofErr w:type="spellStart"/>
+      <w:r>
+        <w:t>PSA_low</w:t>
+      </w:r>
+      <w:proofErr w:type="spellEnd"/>
+      <w:r>
+        <w:t xml:space="preserve"> for Beta rows (not a CI bound).</w:t>
       </w:r>
     </w:p>
     <w:p>
@@ -5663,7 +6277,31 @@
         <w:t xml:space="preserve">: </w:t>
       </w:r>
       <w:r>
-        <w:t xml:space="preserve">Intervention-arm probabilities are derived from control probabilities and sampled ORs using the standard odds transformation (p_treat = OR * odds_control / (1 + OR * odds_control)), with </w:t>
+        <w:t>Intervention-arm probabilities are derived from control probabilities and sampled ORs using the standard odds transformation (</w:t>
+      </w:r>
+      <w:proofErr w:type="spellStart"/>
+      <w:r>
+        <w:t>p_treat</w:t>
+      </w:r>
+      <w:proofErr w:type="spellEnd"/>
+      <w:r>
+        <w:t xml:space="preserve"> = OR * </w:t>
+      </w:r>
+      <w:proofErr w:type="spellStart"/>
+      <w:r>
+        <w:t>odds_control</w:t>
+      </w:r>
+      <w:proofErr w:type="spellEnd"/>
+      <w:r>
+        <w:t xml:space="preserve"> / (1 + OR * </w:t>
+      </w:r>
+      <w:proofErr w:type="spellStart"/>
+      <w:r>
+        <w:t>odds_control</w:t>
+      </w:r>
+      <w:proofErr w:type="spellEnd"/>
+      <w:r>
+        <w:t xml:space="preserve">)), with </w:t>
       </w:r>
       <w:r>
         <w:t>bounds</w:t>
@@ -5688,7 +6326,15 @@
         <w:t xml:space="preserve">: </w:t>
       </w:r>
       <w:r>
-        <w:t>The PSA creates full sample sets for utilities, costs, and mortality by mRS; deterministic values used by the base model come directly from the parameter file (base_case), not from PSA medians.</w:t>
+        <w:t>The PSA creates full sample sets for utilities, costs, and mortality by mRS; deterministic values used by the base model come directly from the parameter file (</w:t>
+      </w:r>
+      <w:proofErr w:type="spellStart"/>
+      <w:r>
+        <w:t>base_case</w:t>
+      </w:r>
+      <w:proofErr w:type="spellEnd"/>
+      <w:r>
+        <w:t>), not from PSA medians.</w:t>
       </w:r>
     </w:p>
     <w:p>
@@ -5707,10 +6353,18 @@
         <w:t xml:space="preserve">: </w:t>
       </w:r>
       <w:r>
-        <w:t>mRS is treated as an integer key (0–6) across parameter files and PSA outputs</w:t>
-      </w:r>
-      <w:r>
-        <w:t>Utilities and costs for mRS 6 are set to 0; RR for mRS 6 is NA (dead state, not used). Ensure your parameter file has mRS recorded as integers 0–6.</w:t>
+        <w:t xml:space="preserve">mRS is treated as an integer key (0–6) across parameter files and PSA </w:t>
+      </w:r>
+      <w:proofErr w:type="spellStart"/>
+      <w:r>
+        <w:t>outputs</w:t>
+      </w:r>
+      <w:r>
+        <w:t>Utilities</w:t>
+      </w:r>
+      <w:proofErr w:type="spellEnd"/>
+      <w:r>
+        <w:t xml:space="preserve"> and costs for mRS 6 are set to 0; RR for mRS 6 is NA (dead state, not used). Ensure your parameter file has mRS recorded as integers 0–6.</w:t>
       </w:r>
     </w:p>
     <w:p>
@@ -5755,8 +6409,21 @@
       <w:r>
         <w:t xml:space="preserve"> </w:t>
       </w:r>
-      <w:r>
-        <w:t>low.results[[variable_name]] &lt;- result</w:t>
+      <w:proofErr w:type="spellStart"/>
+      <w:r>
+        <w:t>low.results</w:t>
+      </w:r>
+      <w:proofErr w:type="spellEnd"/>
+      <w:r>
+        <w:t>[[</w:t>
+      </w:r>
+      <w:proofErr w:type="spellStart"/>
+      <w:r>
+        <w:t>variable_name</w:t>
+      </w:r>
+      <w:proofErr w:type="spellEnd"/>
+      <w:r>
+        <w:t>]] &lt;- result</w:t>
       </w:r>
     </w:p>
     <w:p>
@@ -5830,34 +6497,114 @@
         <w:divId w:val="860977169"/>
       </w:pPr>
       <w:r>
-        <w:t>- outputs/base_case_results.RData → contains base_case, a list with:</w:t>
+        <w:t>- outputs/</w:t>
+      </w:r>
+      <w:proofErr w:type="spellStart"/>
+      <w:r>
+        <w:t>base_case_results.RData</w:t>
+      </w:r>
+      <w:proofErr w:type="spellEnd"/>
+      <w:r>
+        <w:t xml:space="preserve"> → contains </w:t>
+      </w:r>
+      <w:proofErr w:type="spellStart"/>
+      <w:r>
+        <w:t>base_case</w:t>
+      </w:r>
+      <w:proofErr w:type="spellEnd"/>
+      <w:r>
+        <w:t>, a list with:</w:t>
       </w:r>
       <w:r>
         <w:br/>
-        <w:t xml:space="preserve">  - summary_data_all: totals by strategy (costs, QALYs)</w:t>
+        <w:t xml:space="preserve">  - </w:t>
+      </w:r>
+      <w:proofErr w:type="spellStart"/>
+      <w:r>
+        <w:t>summary_data_all</w:t>
+      </w:r>
+      <w:proofErr w:type="spellEnd"/>
+      <w:r>
+        <w:t>: totals by strategy (costs, QALYs)</w:t>
       </w:r>
       <w:r>
         <w:br/>
       </w:r>
       <w:r>
         <w:lastRenderedPageBreak/>
-        <w:t xml:space="preserve">  - incremental_results: key incremental outcomes and Net Monetary Benefit (NMB)</w:t>
+        <w:t xml:space="preserve">  - </w:t>
+      </w:r>
+      <w:proofErr w:type="spellStart"/>
+      <w:r>
+        <w:t>incremental_results</w:t>
+      </w:r>
+      <w:proofErr w:type="spellEnd"/>
+      <w:r>
+        <w:t>: key incremental outcomes and Net Monetary Benefit (NMB)</w:t>
       </w:r>
       <w:r>
         <w:br/>
-        <w:t xml:space="preserve">  - process_results: pathway/process counts and component costs/QALYs</w:t>
+        <w:t xml:space="preserve">  - </w:t>
+      </w:r>
+      <w:proofErr w:type="spellStart"/>
+      <w:r>
+        <w:t>process_results</w:t>
+      </w:r>
+      <w:proofErr w:type="spellEnd"/>
+      <w:r>
+        <w:t>: pathway/process counts and component costs/QALYs</w:t>
       </w:r>
       <w:r>
         <w:br/>
-        <w:t xml:space="preserve">  - mrs.trace: Markov trace (mRS0–mRS6 over cycles)</w:t>
+        <w:t xml:space="preserve">  - </w:t>
+      </w:r>
+      <w:proofErr w:type="spellStart"/>
+      <w:r>
+        <w:t>mrs.trace</w:t>
+      </w:r>
+      <w:proofErr w:type="spellEnd"/>
+      <w:r>
+        <w:t>: Markov trace (mRS0–mRS6 over cycles)</w:t>
       </w:r>
       <w:r>
         <w:br/>
-        <w:t xml:space="preserve">  - trace.standard / trace.intervention: decision-tree traces</w:t>
+        <w:t xml:space="preserve">  - </w:t>
+      </w:r>
+      <w:proofErr w:type="spellStart"/>
+      <w:r>
+        <w:t>trace.standard</w:t>
+      </w:r>
+      <w:proofErr w:type="spellEnd"/>
+      <w:r>
+        <w:t xml:space="preserve"> / </w:t>
+      </w:r>
+      <w:proofErr w:type="spellStart"/>
+      <w:r>
+        <w:t>trace.intervention</w:t>
+      </w:r>
+      <w:proofErr w:type="spellEnd"/>
+      <w:r>
+        <w:t>: decision-tree traces</w:t>
       </w:r>
       <w:r>
         <w:br/>
-        <w:t xml:space="preserve">  - tm.standard / tm.intervention: transition arrays (per cycle)</w:t>
+        <w:t xml:space="preserve">  - </w:t>
+      </w:r>
+      <w:proofErr w:type="spellStart"/>
+      <w:r>
+        <w:t>tm.standard</w:t>
+      </w:r>
+      <w:proofErr w:type="spellEnd"/>
+      <w:r>
+        <w:t xml:space="preserve"> / </w:t>
+      </w:r>
+      <w:proofErr w:type="spellStart"/>
+      <w:r>
+        <w:t>tm.intervention</w:t>
+      </w:r>
+      <w:proofErr w:type="spellEnd"/>
+      <w:r>
+        <w:t>: transition arrays (per cycle)</w:t>
       </w:r>
       <w:r>
         <w:br/>
@@ -5870,10 +6617,18 @@
         <w:divId w:val="860977169"/>
       </w:pPr>
       <w:r>
-        <w:t>- DSA</w:t>
-      </w:r>
-      <w:r>
-        <w:t>_results:</w:t>
+        <w:t xml:space="preserve">- </w:t>
+      </w:r>
+      <w:proofErr w:type="spellStart"/>
+      <w:r>
+        <w:t>DSA</w:t>
+      </w:r>
+      <w:r>
+        <w:t>_results</w:t>
+      </w:r>
+      <w:proofErr w:type="spellEnd"/>
+      <w:r>
+        <w:t>:</w:t>
       </w:r>
       <w:r>
         <w:t xml:space="preserve"> results</w:t>
@@ -5926,11 +6681,27 @@
         <w:divId w:val="860977169"/>
       </w:pPr>
       <w:r>
-        <w:t>- outputs/network_results.RData (ISDN-level list of model results) and outputs/ISDN_incremental_results.csv</w:t>
+        <w:t>- outputs/</w:t>
+      </w:r>
+      <w:proofErr w:type="spellStart"/>
+      <w:r>
+        <w:t>network_results.RData</w:t>
+      </w:r>
+      <w:proofErr w:type="spellEnd"/>
+      <w:r>
+        <w:t xml:space="preserve"> (ISDN-level list of model results) and outputs/ISDN_incremental_results.csv</w:t>
       </w:r>
       <w:r>
         <w:br/>
-        <w:t>- outputs/hospital_results.RData (hospital-level list of model results) and outputs/hospital_incremental_results.csv</w:t>
+        <w:t>- outputs/</w:t>
+      </w:r>
+      <w:proofErr w:type="spellStart"/>
+      <w:r>
+        <w:t>hospital_results.RData</w:t>
+      </w:r>
+      <w:proofErr w:type="spellEnd"/>
+      <w:r>
+        <w:t xml:space="preserve"> (hospital-level list of model results) and outputs/hospital_incremental_results.csv</w:t>
       </w:r>
     </w:p>
     <w:p>
@@ -6015,7 +6786,39 @@
         <w:t>HTML</w:t>
       </w:r>
       <w:r>
-        <w:t xml:space="preserve"> report (Report_Creation.Rmd) reads base_case_results.RData, network_results.RData, and hospital_results.RData.</w:t>
+        <w:t xml:space="preserve"> report (</w:t>
+      </w:r>
+      <w:proofErr w:type="spellStart"/>
+      <w:r>
+        <w:t>Report_Creation.Rmd</w:t>
+      </w:r>
+      <w:proofErr w:type="spellEnd"/>
+      <w:r>
+        <w:t xml:space="preserve">) reads </w:t>
+      </w:r>
+      <w:proofErr w:type="spellStart"/>
+      <w:r>
+        <w:t>base_case_results.RData</w:t>
+      </w:r>
+      <w:proofErr w:type="spellEnd"/>
+      <w:r>
+        <w:t xml:space="preserve">, </w:t>
+      </w:r>
+      <w:proofErr w:type="spellStart"/>
+      <w:r>
+        <w:t>network_results.RData</w:t>
+      </w:r>
+      <w:proofErr w:type="spellEnd"/>
+      <w:r>
+        <w:t xml:space="preserve">, and </w:t>
+      </w:r>
+      <w:proofErr w:type="spellStart"/>
+      <w:r>
+        <w:t>hospital_results.RData</w:t>
+      </w:r>
+      <w:proofErr w:type="spellEnd"/>
+      <w:r>
+        <w:t>.</w:t>
       </w:r>
     </w:p>
     <w:p>
@@ -6130,8 +6933,39 @@
           <w:sz w:val="22"/>
           <w:szCs w:val="21"/>
         </w:rPr>
-        <w:t>ΔQALY = QALY_Intervention − QALY_Standard</w:t>
-      </w:r>
+        <w:t xml:space="preserve">ΔQALY = </w:t>
+      </w:r>
+      <w:proofErr w:type="spellStart"/>
+      <w:r>
+        <w:rPr>
+          <w:rFonts w:asciiTheme="minorHAnsi" w:hAnsiTheme="minorHAnsi" w:cs="Segoe UI"/>
+          <w:color w:val="000000"/>
+          <w:sz w:val="22"/>
+          <w:szCs w:val="21"/>
+        </w:rPr>
+        <w:t>QALY_Intervention</w:t>
+      </w:r>
+      <w:proofErr w:type="spellEnd"/>
+      <w:r>
+        <w:rPr>
+          <w:rFonts w:asciiTheme="minorHAnsi" w:hAnsiTheme="minorHAnsi" w:cs="Segoe UI"/>
+          <w:color w:val="000000"/>
+          <w:sz w:val="22"/>
+          <w:szCs w:val="21"/>
+        </w:rPr>
+        <w:t xml:space="preserve"> − </w:t>
+      </w:r>
+      <w:proofErr w:type="spellStart"/>
+      <w:r>
+        <w:rPr>
+          <w:rFonts w:asciiTheme="minorHAnsi" w:hAnsiTheme="minorHAnsi" w:cs="Segoe UI"/>
+          <w:color w:val="000000"/>
+          <w:sz w:val="22"/>
+          <w:szCs w:val="21"/>
+        </w:rPr>
+        <w:t>QALY_Standard</w:t>
+      </w:r>
+      <w:proofErr w:type="spellEnd"/>
     </w:p>
     <w:p>
       <w:pPr>
@@ -6146,6 +6980,7 @@
           <w:szCs w:val="21"/>
         </w:rPr>
       </w:pPr>
+      <w:proofErr w:type="spellStart"/>
       <w:r>
         <w:rPr>
           <w:rFonts w:asciiTheme="minorHAnsi" w:hAnsiTheme="minorHAnsi" w:cs="Segoe UI"/>
@@ -6153,8 +6988,49 @@
           <w:sz w:val="22"/>
           <w:szCs w:val="21"/>
         </w:rPr>
-        <w:t>ΔCost = Cost_Intervention − Cost_Standard</w:t>
-      </w:r>
+        <w:t>ΔCost</w:t>
+      </w:r>
+      <w:proofErr w:type="spellEnd"/>
+      <w:r>
+        <w:rPr>
+          <w:rFonts w:asciiTheme="minorHAnsi" w:hAnsiTheme="minorHAnsi" w:cs="Segoe UI"/>
+          <w:color w:val="000000"/>
+          <w:sz w:val="22"/>
+          <w:szCs w:val="21"/>
+        </w:rPr>
+        <w:t xml:space="preserve"> = </w:t>
+      </w:r>
+      <w:proofErr w:type="spellStart"/>
+      <w:r>
+        <w:rPr>
+          <w:rFonts w:asciiTheme="minorHAnsi" w:hAnsiTheme="minorHAnsi" w:cs="Segoe UI"/>
+          <w:color w:val="000000"/>
+          <w:sz w:val="22"/>
+          <w:szCs w:val="21"/>
+        </w:rPr>
+        <w:t>Cost_Intervention</w:t>
+      </w:r>
+      <w:proofErr w:type="spellEnd"/>
+      <w:r>
+        <w:rPr>
+          <w:rFonts w:asciiTheme="minorHAnsi" w:hAnsiTheme="minorHAnsi" w:cs="Segoe UI"/>
+          <w:color w:val="000000"/>
+          <w:sz w:val="22"/>
+          <w:szCs w:val="21"/>
+        </w:rPr>
+        <w:t xml:space="preserve"> − </w:t>
+      </w:r>
+      <w:proofErr w:type="spellStart"/>
+      <w:r>
+        <w:rPr>
+          <w:rFonts w:asciiTheme="minorHAnsi" w:hAnsiTheme="minorHAnsi" w:cs="Segoe UI"/>
+          <w:color w:val="000000"/>
+          <w:sz w:val="22"/>
+          <w:szCs w:val="21"/>
+        </w:rPr>
+        <w:t>Cost_Standard</w:t>
+      </w:r>
+      <w:proofErr w:type="spellEnd"/>
     </w:p>
     <w:p>
       <w:pPr>
@@ -6176,7 +7052,27 @@
           <w:sz w:val="22"/>
           <w:szCs w:val="21"/>
         </w:rPr>
-        <w:t>Positive ΔQALY indicates health gain; negative ΔCost indicates cost savings.</w:t>
+        <w:t xml:space="preserve">Positive ΔQALY indicates health gain; negative </w:t>
+      </w:r>
+      <w:proofErr w:type="spellStart"/>
+      <w:r>
+        <w:rPr>
+          <w:rFonts w:asciiTheme="minorHAnsi" w:hAnsiTheme="minorHAnsi" w:cs="Segoe UI"/>
+          <w:color w:val="000000"/>
+          <w:sz w:val="22"/>
+          <w:szCs w:val="21"/>
+        </w:rPr>
+        <w:t>ΔCost</w:t>
+      </w:r>
+      <w:proofErr w:type="spellEnd"/>
+      <w:r>
+        <w:rPr>
+          <w:rFonts w:asciiTheme="minorHAnsi" w:hAnsiTheme="minorHAnsi" w:cs="Segoe UI"/>
+          <w:color w:val="000000"/>
+          <w:sz w:val="22"/>
+          <w:szCs w:val="21"/>
+        </w:rPr>
+        <w:t xml:space="preserve"> indicates cost savings.</w:t>
       </w:r>
     </w:p>
     <w:p>
@@ -6255,8 +7151,19 @@
           <w:sz w:val="22"/>
           <w:szCs w:val="21"/>
         </w:rPr>
-        <w:t>NMB = (ΔQALY × WTP) − ΔCost</w:t>
-      </w:r>
+        <w:t xml:space="preserve">NMB = (ΔQALY × WTP) − </w:t>
+      </w:r>
+      <w:proofErr w:type="spellStart"/>
+      <w:r>
+        <w:rPr>
+          <w:rFonts w:asciiTheme="minorHAnsi" w:hAnsiTheme="minorHAnsi" w:cs="Segoe UI"/>
+          <w:color w:val="000000"/>
+          <w:sz w:val="22"/>
+          <w:szCs w:val="21"/>
+        </w:rPr>
+        <w:t>ΔCost</w:t>
+      </w:r>
+      <w:proofErr w:type="spellEnd"/>
     </w:p>
     <w:p>
       <w:pPr>
@@ -6399,7 +7306,27 @@
           <w:sz w:val="22"/>
           <w:szCs w:val="21"/>
         </w:rPr>
-        <w:t>- CE plane: each point is a PSA draw of (ΔQALY, ΔCost); the line with slope = WTP (e.g., 20,000) separates cost-effective from not.</w:t>
+        <w:t xml:space="preserve">- CE plane: each point is a PSA draw of (ΔQALY, </w:t>
+      </w:r>
+      <w:proofErr w:type="spellStart"/>
+      <w:r>
+        <w:rPr>
+          <w:rFonts w:asciiTheme="minorHAnsi" w:hAnsiTheme="minorHAnsi" w:cs="Segoe UI"/>
+          <w:color w:val="000000"/>
+          <w:sz w:val="22"/>
+          <w:szCs w:val="21"/>
+        </w:rPr>
+        <w:t>ΔCost</w:t>
+      </w:r>
+      <w:proofErr w:type="spellEnd"/>
+      <w:r>
+        <w:rPr>
+          <w:rFonts w:asciiTheme="minorHAnsi" w:hAnsiTheme="minorHAnsi" w:cs="Segoe UI"/>
+          <w:color w:val="000000"/>
+          <w:sz w:val="22"/>
+          <w:szCs w:val="21"/>
+        </w:rPr>
+        <w:t>); the line with slope = WTP (e.g., 20,000) separates cost-effective from not.</w:t>
       </w:r>
     </w:p>
     <w:p>
@@ -6505,7 +7432,23 @@
         <w:divId w:val="860977169"/>
       </w:pPr>
       <w:r>
-        <w:t>In “1_hospital_data_processing.R” it is hard-coded which year filter is used with “isdn &lt;- isdn[date=="Apr 2022-Mar 2023"]” . If a later refresh lands, you’ll unknowingly drop newer data.</w:t>
+        <w:t>In “1_hospital_data_processing.R” it is hard-coded which year filter is used with “</w:t>
+      </w:r>
+      <w:proofErr w:type="spellStart"/>
+      <w:r>
+        <w:t>isdn</w:t>
+      </w:r>
+      <w:proofErr w:type="spellEnd"/>
+      <w:r>
+        <w:t xml:space="preserve"> &lt;- </w:t>
+      </w:r>
+      <w:proofErr w:type="spellStart"/>
+      <w:r>
+        <w:t>isdn</w:t>
+      </w:r>
+      <w:proofErr w:type="spellEnd"/>
+      <w:r>
+        <w:t>[date=="Apr 2022-Mar 2023"]” . If a later refresh lands, you’ll unknowingly drop newer data.</w:t>
       </w:r>
     </w:p>
     <w:p>
@@ -6555,6 +7498,7 @@
         <w:spacing w:after="0"/>
         <w:divId w:val="860977169"/>
       </w:pPr>
+      <w:proofErr w:type="spellStart"/>
       <w:r>
         <w:rPr>
           <w:b/>
@@ -6562,6 +7506,7 @@
         </w:rPr>
         <w:t>n.stroke</w:t>
       </w:r>
+      <w:proofErr w:type="spellEnd"/>
       <w:r>
         <w:t xml:space="preserve"> is a single non-negative integer.</w:t>
       </w:r>

</xml_diff>

<commit_message>
update user guide to match updated code
</commit_message>
<xml_diff>
--- a/User_Guide.docx
+++ b/User_Guide.docx
@@ -109,7 +109,7 @@
           <w:lang w:val="en-US"/>
           <w14:ligatures w14:val="none"/>
         </w:rPr>
-        <w:t>3</w:t>
+        <w:t>4</w:t>
       </w:r>
     </w:p>
     <w:p>
@@ -182,18 +182,9 @@
           <w:lang w:val="en-US"/>
           <w14:ligatures w14:val="none"/>
         </w:rPr>
-        <w:t>V1.0</w:t>
-      </w:r>
-    </w:p>
-    <w:p>
-      <w:pPr>
-        <w:pStyle w:val="Subtitle"/>
-        <w:numPr>
-          <w:ilvl w:val="0"/>
-          <w:numId w:val="0"/>
-        </w:numPr>
-        <w:spacing w:after="200" w:line="276" w:lineRule="auto"/>
-        <w:divId w:val="860977169"/>
+        <w:t>V</w:t>
+      </w:r>
+      <w:r>
         <w:rPr>
           <w:i/>
           <w:iCs/>
@@ -204,7 +195,8 @@
           <w:lang w:val="en-US"/>
           <w14:ligatures w14:val="none"/>
         </w:rPr>
-      </w:pPr>
+        <w:t>2</w:t>
+      </w:r>
       <w:r>
         <w:rPr>
           <w:i/>
@@ -216,9 +208,18 @@
           <w:lang w:val="en-US"/>
           <w14:ligatures w14:val="none"/>
         </w:rPr>
-        <w:t xml:space="preserve">Version of R: </w:t>
-      </w:r>
-      <w:r>
+        <w:t>.0</w:t>
+      </w:r>
+    </w:p>
+    <w:p>
+      <w:pPr>
+        <w:pStyle w:val="Subtitle"/>
+        <w:numPr>
+          <w:ilvl w:val="0"/>
+          <w:numId w:val="0"/>
+        </w:numPr>
+        <w:spacing w:after="200" w:line="276" w:lineRule="auto"/>
+        <w:divId w:val="860977169"/>
         <w:rPr>
           <w:i/>
           <w:iCs/>
@@ -229,9 +230,7 @@
           <w:lang w:val="en-US"/>
           <w14:ligatures w14:val="none"/>
         </w:rPr>
-        <w:t xml:space="preserve">R version 4.5.1 (2025-06-13 </w:t>
-      </w:r>
-      <w:proofErr w:type="spellStart"/>
+      </w:pPr>
       <w:r>
         <w:rPr>
           <w:i/>
@@ -243,9 +242,8 @@
           <w:lang w:val="en-US"/>
           <w14:ligatures w14:val="none"/>
         </w:rPr>
-        <w:t>ucrt</w:t>
-      </w:r>
-      <w:proofErr w:type="spellEnd"/>
+        <w:t xml:space="preserve">Version of R: </w:t>
+      </w:r>
       <w:r>
         <w:rPr>
           <w:i/>
@@ -257,7 +255,7 @@
           <w:lang w:val="en-US"/>
           <w14:ligatures w14:val="none"/>
         </w:rPr>
-        <w:t>) -- "Great Square Root". Copyright (C) 2025 The R Foundation for Statistical Computing</w:t>
+        <w:t>R version 4.5.1 (2025-06-13 ucrt) -- "Great Square Root". Copyright (C) 2025 The R Foundation for Statistical Computing</w:t>
       </w:r>
     </w:p>
     <w:p>
@@ -1502,15 +1500,7 @@
         <w:t xml:space="preserve">To download the R project, </w:t>
       </w:r>
       <w:r>
-        <w:t xml:space="preserve">you can link to </w:t>
-      </w:r>
-      <w:proofErr w:type="spellStart"/>
-      <w:r>
-        <w:t>Github</w:t>
-      </w:r>
-      <w:proofErr w:type="spellEnd"/>
-      <w:r>
-        <w:t xml:space="preserve"> via SSH or </w:t>
+        <w:t xml:space="preserve">you can link to Github via SSH or </w:t>
       </w:r>
       <w:r>
         <w:t>download the whole project as a zip folder by clicking on the “&lt;&gt;Code” button in the right hand corner:</w:t>
@@ -1741,23 +1731,16 @@
         <w:divId w:val="860977169"/>
       </w:pPr>
       <w:r>
-        <w:t xml:space="preserve">Required packages include: ggplot2, </w:t>
-      </w:r>
-      <w:proofErr w:type="spellStart"/>
-      <w:r>
-        <w:t>data.table</w:t>
-      </w:r>
-      <w:proofErr w:type="spellEnd"/>
-      <w:r>
-        <w:t xml:space="preserve">, parallel, </w:t>
-      </w:r>
-      <w:proofErr w:type="spellStart"/>
-      <w:r>
-        <w:t>assertthat</w:t>
-      </w:r>
-      <w:proofErr w:type="spellEnd"/>
-      <w:r>
-        <w:t xml:space="preserve"> (these are downloaded within the model script below so don’t worry you don’t need to do anything yet about this). </w:t>
+        <w:t xml:space="preserve">Required packages include: ggplot2, data.table, parallel, assertthat (these are downloaded within the model script below so don’t worry you don’t need to do anything yet about this). </w:t>
+      </w:r>
+      <w:r>
+        <w:t xml:space="preserve">Updated model versions also require </w:t>
+      </w:r>
+      <w:r>
+        <w:t>stringr and scales</w:t>
+      </w:r>
+      <w:r>
+        <w:t xml:space="preserve">, these may need downloading prior to model running. </w:t>
       </w:r>
     </w:p>
     <w:p>
@@ -1891,6 +1874,7 @@
                 <w:sz w:val="20"/>
                 <w:szCs w:val="20"/>
               </w:rPr>
+              <w:lastRenderedPageBreak/>
               <w:t>ASC</w:t>
             </w:r>
           </w:p>
@@ -1936,7 +1920,6 @@
                 <w:sz w:val="20"/>
                 <w:szCs w:val="20"/>
               </w:rPr>
-              <w:lastRenderedPageBreak/>
               <w:t>CSC</w:t>
             </w:r>
           </w:p>
@@ -3193,42 +3176,8 @@
           <w:color w:val="000000"/>
           <w:szCs w:val="32"/>
         </w:rPr>
-        <w:t>outputs/</w:t>
-      </w:r>
-      <w:proofErr w:type="spellStart"/>
-      <w:r>
-        <w:rPr>
-          <w:rFonts w:eastAsia="Times New Roman" w:cs="Segoe UI"/>
-          <w:i w:val="0"/>
-          <w:iCs w:val="0"/>
-          <w:color w:val="000000"/>
-          <w:szCs w:val="32"/>
-        </w:rPr>
-        <w:t>base_case_results.RData</w:t>
-      </w:r>
-      <w:proofErr w:type="spellEnd"/>
-      <w:r>
-        <w:rPr>
-          <w:rFonts w:eastAsia="Times New Roman" w:cs="Segoe UI"/>
-          <w:i w:val="0"/>
-          <w:iCs w:val="0"/>
-          <w:color w:val="000000"/>
-          <w:szCs w:val="32"/>
-        </w:rPr>
-        <w:t xml:space="preserve"> → contains an object </w:t>
-      </w:r>
-      <w:proofErr w:type="spellStart"/>
-      <w:r>
-        <w:rPr>
-          <w:rFonts w:eastAsia="Times New Roman" w:cs="Segoe UI"/>
-          <w:i w:val="0"/>
-          <w:iCs w:val="0"/>
-          <w:color w:val="000000"/>
-          <w:szCs w:val="32"/>
-        </w:rPr>
-        <w:t>base_case</w:t>
-      </w:r>
-      <w:proofErr w:type="spellEnd"/>
+        <w:t>outputs/base_case_results.RData → contains an object base_case</w:t>
+      </w:r>
     </w:p>
     <w:p>
       <w:pPr>
@@ -3260,51 +3209,7 @@
           <w:color w:val="000000"/>
           <w:szCs w:val="32"/>
         </w:rPr>
-        <w:t>outputs/</w:t>
-      </w:r>
-      <w:proofErr w:type="spellStart"/>
-      <w:r>
-        <w:rPr>
-          <w:rFonts w:eastAsia="Times New Roman" w:cs="Segoe UI"/>
-          <w:i w:val="0"/>
-          <w:iCs w:val="0"/>
-          <w:color w:val="000000"/>
-          <w:szCs w:val="32"/>
-        </w:rPr>
-        <w:t>network_results.RData</w:t>
-      </w:r>
-      <w:proofErr w:type="spellEnd"/>
-      <w:r>
-        <w:rPr>
-          <w:rFonts w:eastAsia="Times New Roman" w:cs="Segoe UI"/>
-          <w:i w:val="0"/>
-          <w:iCs w:val="0"/>
-          <w:color w:val="000000"/>
-          <w:szCs w:val="32"/>
-        </w:rPr>
-        <w:t xml:space="preserve"> → contains a named list </w:t>
-      </w:r>
-      <w:proofErr w:type="spellStart"/>
-      <w:r>
-        <w:rPr>
-          <w:rFonts w:eastAsia="Times New Roman" w:cs="Segoe UI"/>
-          <w:i w:val="0"/>
-          <w:iCs w:val="0"/>
-          <w:color w:val="000000"/>
-          <w:szCs w:val="32"/>
-        </w:rPr>
-        <w:t>network_results</w:t>
-      </w:r>
-      <w:proofErr w:type="spellEnd"/>
-      <w:r>
-        <w:rPr>
-          <w:rFonts w:eastAsia="Times New Roman" w:cs="Segoe UI"/>
-          <w:i w:val="0"/>
-          <w:iCs w:val="0"/>
-          <w:color w:val="000000"/>
-          <w:szCs w:val="32"/>
-        </w:rPr>
-        <w:t xml:space="preserve"> (names = ISDNs)</w:t>
+        <w:t>outputs/network_results.RData → contains a named list network_results (names = ISDNs)</w:t>
       </w:r>
     </w:p>
     <w:p>
@@ -3337,51 +3242,7 @@
           <w:color w:val="000000"/>
           <w:szCs w:val="32"/>
         </w:rPr>
-        <w:t>outputs/</w:t>
-      </w:r>
-      <w:proofErr w:type="spellStart"/>
-      <w:r>
-        <w:rPr>
-          <w:rFonts w:eastAsia="Times New Roman" w:cs="Segoe UI"/>
-          <w:i w:val="0"/>
-          <w:iCs w:val="0"/>
-          <w:color w:val="000000"/>
-          <w:szCs w:val="32"/>
-        </w:rPr>
-        <w:t>hospital_results.RData</w:t>
-      </w:r>
-      <w:proofErr w:type="spellEnd"/>
-      <w:r>
-        <w:rPr>
-          <w:rFonts w:eastAsia="Times New Roman" w:cs="Segoe UI"/>
-          <w:i w:val="0"/>
-          <w:iCs w:val="0"/>
-          <w:color w:val="000000"/>
-          <w:szCs w:val="32"/>
-        </w:rPr>
-        <w:t xml:space="preserve"> → contains a named list </w:t>
-      </w:r>
-      <w:proofErr w:type="spellStart"/>
-      <w:r>
-        <w:rPr>
-          <w:rFonts w:eastAsia="Times New Roman" w:cs="Segoe UI"/>
-          <w:i w:val="0"/>
-          <w:iCs w:val="0"/>
-          <w:color w:val="000000"/>
-          <w:szCs w:val="32"/>
-        </w:rPr>
-        <w:t>hospital_results</w:t>
-      </w:r>
-      <w:proofErr w:type="spellEnd"/>
-      <w:r>
-        <w:rPr>
-          <w:rFonts w:eastAsia="Times New Roman" w:cs="Segoe UI"/>
-          <w:i w:val="0"/>
-          <w:iCs w:val="0"/>
-          <w:color w:val="000000"/>
-          <w:szCs w:val="32"/>
-        </w:rPr>
-        <w:t xml:space="preserve"> (names = Hospitals)</w:t>
+        <w:t>outputs/hospital_results.RData → contains a named list hospital_results (names = Hospitals)</w:t>
       </w:r>
     </w:p>
     <w:p>
@@ -3471,7 +3332,6 @@
           <w:color w:val="auto"/>
         </w:rPr>
       </w:pPr>
-      <w:proofErr w:type="spellStart"/>
       <w:r>
         <w:rPr>
           <w:i w:val="0"/>
@@ -3479,9 +3339,8 @@
           <w:color w:val="auto"/>
           <w:highlight w:val="lightGray"/>
         </w:rPr>
-        <w:t>install.packages</w:t>
-      </w:r>
-      <w:proofErr w:type="spellEnd"/>
+        <w:t>install.packages(c("rmarkdown", "knitr", "htmltools"</w:t>
+      </w:r>
       <w:r>
         <w:rPr>
           <w:i w:val="0"/>
@@ -3489,9 +3348,8 @@
           <w:color w:val="auto"/>
           <w:highlight w:val="lightGray"/>
         </w:rPr>
-        <w:t>(c("</w:t>
-      </w:r>
-      <w:proofErr w:type="spellStart"/>
+        <w:t>,”</w:t>
+      </w:r>
       <w:r>
         <w:rPr>
           <w:i w:val="0"/>
@@ -3499,95 +3357,7 @@
           <w:color w:val="auto"/>
           <w:highlight w:val="lightGray"/>
         </w:rPr>
-        <w:t>rmarkdown</w:t>
-      </w:r>
-      <w:proofErr w:type="spellEnd"/>
-      <w:r>
-        <w:rPr>
-          <w:i w:val="0"/>
-          <w:iCs w:val="0"/>
-          <w:color w:val="auto"/>
-          <w:highlight w:val="lightGray"/>
-        </w:rPr>
-        <w:t>", "</w:t>
-      </w:r>
-      <w:proofErr w:type="spellStart"/>
-      <w:r>
-        <w:rPr>
-          <w:i w:val="0"/>
-          <w:iCs w:val="0"/>
-          <w:color w:val="auto"/>
-          <w:highlight w:val="lightGray"/>
-        </w:rPr>
-        <w:t>knitr</w:t>
-      </w:r>
-      <w:proofErr w:type="spellEnd"/>
-      <w:r>
-        <w:rPr>
-          <w:i w:val="0"/>
-          <w:iCs w:val="0"/>
-          <w:color w:val="auto"/>
-          <w:highlight w:val="lightGray"/>
-        </w:rPr>
-        <w:t>", "</w:t>
-      </w:r>
-      <w:proofErr w:type="spellStart"/>
-      <w:r>
-        <w:rPr>
-          <w:i w:val="0"/>
-          <w:iCs w:val="0"/>
-          <w:color w:val="auto"/>
-          <w:highlight w:val="lightGray"/>
-        </w:rPr>
-        <w:t>htmltools</w:t>
-      </w:r>
-      <w:proofErr w:type="spellEnd"/>
-      <w:r>
-        <w:rPr>
-          <w:i w:val="0"/>
-          <w:iCs w:val="0"/>
-          <w:color w:val="auto"/>
-          <w:highlight w:val="lightGray"/>
-        </w:rPr>
-        <w:t>"</w:t>
-      </w:r>
-      <w:r>
-        <w:rPr>
-          <w:i w:val="0"/>
-          <w:iCs w:val="0"/>
-          <w:color w:val="auto"/>
-          <w:highlight w:val="lightGray"/>
-        </w:rPr>
-        <w:t>,”</w:t>
-      </w:r>
-      <w:r>
-        <w:rPr>
-          <w:i w:val="0"/>
-          <w:iCs w:val="0"/>
-          <w:color w:val="auto"/>
-          <w:highlight w:val="lightGray"/>
-        </w:rPr>
-        <w:t>"</w:t>
-      </w:r>
-      <w:proofErr w:type="spellStart"/>
-      <w:r>
-        <w:rPr>
-          <w:i w:val="0"/>
-          <w:iCs w:val="0"/>
-          <w:color w:val="auto"/>
-          <w:highlight w:val="lightGray"/>
-        </w:rPr>
-        <w:t>kableExtra</w:t>
-      </w:r>
-      <w:proofErr w:type="spellEnd"/>
-      <w:r>
-        <w:rPr>
-          <w:i w:val="0"/>
-          <w:iCs w:val="0"/>
-          <w:color w:val="auto"/>
-          <w:highlight w:val="lightGray"/>
-        </w:rPr>
-        <w:t>")</w:t>
+        <w:t>"kableExtra")</w:t>
       </w:r>
       <w:r>
         <w:rPr>
@@ -3725,9 +3495,8 @@
           <w:color w:val="000000"/>
           <w:szCs w:val="32"/>
         </w:rPr>
-        <w:t xml:space="preserve">Open the </w:t>
-      </w:r>
-      <w:proofErr w:type="spellStart"/>
+        <w:t>Open the R</w:t>
+      </w:r>
       <w:r>
         <w:rPr>
           <w:rFonts w:eastAsia="Times New Roman" w:cs="Segoe UI"/>
@@ -3736,7 +3505,7 @@
           <w:color w:val="000000"/>
           <w:szCs w:val="32"/>
         </w:rPr>
-        <w:t>R</w:t>
+        <w:t>eport_</w:t>
       </w:r>
       <w:r>
         <w:rPr>
@@ -3746,7 +3515,7 @@
           <w:color w:val="000000"/>
           <w:szCs w:val="32"/>
         </w:rPr>
-        <w:t>eport_</w:t>
+        <w:t>Generation</w:t>
       </w:r>
       <w:r>
         <w:rPr>
@@ -3756,19 +3525,8 @@
           <w:color w:val="000000"/>
           <w:szCs w:val="32"/>
         </w:rPr>
-        <w:t>Generation</w:t>
-      </w:r>
-      <w:r>
-        <w:rPr>
-          <w:rFonts w:eastAsia="Times New Roman" w:cs="Segoe UI"/>
-          <w:i w:val="0"/>
-          <w:iCs w:val="0"/>
-          <w:color w:val="000000"/>
-          <w:szCs w:val="32"/>
-        </w:rPr>
         <w:t>.Rmd</w:t>
       </w:r>
-      <w:proofErr w:type="spellEnd"/>
     </w:p>
     <w:p>
       <w:pPr>
@@ -4393,15 +4151,7 @@
         <w:t>W</w:t>
       </w:r>
       <w:r>
-        <w:t xml:space="preserve">hen complete, the file will be automatically available for you to click and open within the </w:t>
-      </w:r>
-      <w:proofErr w:type="spellStart"/>
-      <w:r>
-        <w:t>Rproject</w:t>
-      </w:r>
-      <w:proofErr w:type="spellEnd"/>
-      <w:r>
-        <w:t xml:space="preserve"> folder. </w:t>
+        <w:t xml:space="preserve">hen complete, the file will be automatically available for you to click and open within the Rproject folder. </w:t>
       </w:r>
     </w:p>
     <w:p>
@@ -4427,13 +4177,8 @@
       <w:r>
         <w:t>needed .</w:t>
       </w:r>
-      <w:proofErr w:type="spellStart"/>
-      <w:r>
-        <w:t>RData</w:t>
-      </w:r>
-      <w:proofErr w:type="spellEnd"/>
-      <w:r>
-        <w:t xml:space="preserve"> files exist in /outputs.</w:t>
+      <w:r>
+        <w:t>RData files exist in /outputs.</w:t>
       </w:r>
     </w:p>
     <w:p>
@@ -4453,11 +4198,9 @@
       <w:r>
         <w:t>The package “</w:t>
       </w:r>
-      <w:proofErr w:type="spellStart"/>
       <w:r>
         <w:t>RTools</w:t>
       </w:r>
-      <w:proofErr w:type="spellEnd"/>
       <w:r>
         <w:t>”</w:t>
       </w:r>
@@ -4468,15 +4211,7 @@
         <w:t xml:space="preserve">s to build packages from source (e.g., when </w:t>
       </w:r>
       <w:r>
-        <w:t xml:space="preserve">a precompiled binary isn’t available). For standard CRAN installs on Windows, R will use binaries and </w:t>
-      </w:r>
-      <w:proofErr w:type="spellStart"/>
-      <w:r>
-        <w:t>RTools</w:t>
-      </w:r>
-      <w:proofErr w:type="spellEnd"/>
-      <w:r>
-        <w:t xml:space="preserve"> is not typically required.</w:t>
+        <w:t>a precompiled binary isn’t available). For standard CRAN installs on Windows, R will use binaries and RTools is not typically required.</w:t>
       </w:r>
     </w:p>
     <w:p>
@@ -4654,89 +4389,11 @@
         <w:jc w:val="center"/>
         <w:divId w:val="860977169"/>
       </w:pPr>
-      <w:proofErr w:type="spellStart"/>
       <w:r>
         <w:rPr>
           <w:highlight w:val="lightGray"/>
         </w:rPr>
-        <w:t>install.packages</w:t>
-      </w:r>
-      <w:proofErr w:type="spellEnd"/>
-      <w:r>
-        <w:rPr>
-          <w:highlight w:val="lightGray"/>
-        </w:rPr>
-        <w:t>(c(  "</w:t>
-      </w:r>
-      <w:proofErr w:type="spellStart"/>
-      <w:r>
-        <w:rPr>
-          <w:highlight w:val="lightGray"/>
-        </w:rPr>
-        <w:t>data.table</w:t>
-      </w:r>
-      <w:proofErr w:type="spellEnd"/>
-      <w:r>
-        <w:rPr>
-          <w:highlight w:val="lightGray"/>
-        </w:rPr>
-        <w:t>", "</w:t>
-      </w:r>
-      <w:proofErr w:type="spellStart"/>
-      <w:r>
-        <w:rPr>
-          <w:highlight w:val="lightGray"/>
-        </w:rPr>
-        <w:t>tidyverse</w:t>
-      </w:r>
-      <w:proofErr w:type="spellEnd"/>
-      <w:r>
-        <w:rPr>
-          <w:highlight w:val="lightGray"/>
-        </w:rPr>
-        <w:t>", "</w:t>
-      </w:r>
-      <w:proofErr w:type="spellStart"/>
-      <w:r>
-        <w:rPr>
-          <w:highlight w:val="lightGray"/>
-        </w:rPr>
-        <w:t>assertthat</w:t>
-      </w:r>
-      <w:proofErr w:type="spellEnd"/>
-      <w:r>
-        <w:rPr>
-          <w:highlight w:val="lightGray"/>
-        </w:rPr>
-        <w:t>", "</w:t>
-      </w:r>
-      <w:proofErr w:type="spellStart"/>
-      <w:r>
-        <w:rPr>
-          <w:highlight w:val="lightGray"/>
-        </w:rPr>
-        <w:t>truncnorm</w:t>
-      </w:r>
-      <w:proofErr w:type="spellEnd"/>
-      <w:r>
-        <w:rPr>
-          <w:highlight w:val="lightGray"/>
-        </w:rPr>
-        <w:t>", "conflicted", "scales", "reshape2",  "networkD3", "</w:t>
-      </w:r>
-      <w:proofErr w:type="spellStart"/>
-      <w:r>
-        <w:rPr>
-          <w:highlight w:val="lightGray"/>
-        </w:rPr>
-        <w:t>htmlwidgets</w:t>
-      </w:r>
-      <w:proofErr w:type="spellEnd"/>
-      <w:r>
-        <w:rPr>
-          <w:highlight w:val="lightGray"/>
-        </w:rPr>
-        <w:t>"))</w:t>
+        <w:t>install.packages(c(  "data.table", "tidyverse", "assertthat", "truncnorm", "conflicted", "scales", "reshape2",  "networkD3", "htmlwidgets"))</w:t>
       </w:r>
     </w:p>
     <w:p>
@@ -4901,57 +4558,32 @@
             <w:r>
               <w:t xml:space="preserve"> </w:t>
             </w:r>
-            <w:proofErr w:type="spellStart"/>
-            <w:r>
-              <w:t>model_param</w:t>
-            </w:r>
-            <w:proofErr w:type="spellEnd"/>
-            <w:r>
-              <w:t>;</w:t>
+            <w:r>
+              <w:t>model_param;</w:t>
             </w:r>
             <w:r>
               <w:t xml:space="preserve"> </w:t>
             </w:r>
-            <w:proofErr w:type="spellStart"/>
-            <w:r>
-              <w:t>base_case</w:t>
-            </w:r>
-            <w:proofErr w:type="spellEnd"/>
-            <w:r>
-              <w:t>;</w:t>
+            <w:r>
+              <w:t>base_case;</w:t>
             </w:r>
             <w:r>
               <w:t xml:space="preserve"> </w:t>
             </w:r>
-            <w:proofErr w:type="spellStart"/>
-            <w:r>
-              <w:t>PSA_distribution</w:t>
-            </w:r>
-            <w:proofErr w:type="spellEnd"/>
-            <w:r>
-              <w:t>;</w:t>
+            <w:r>
+              <w:t>PSA_distribution;</w:t>
             </w:r>
             <w:r>
               <w:t xml:space="preserve"> </w:t>
             </w:r>
-            <w:proofErr w:type="spellStart"/>
-            <w:r>
-              <w:t>PSA_low</w:t>
-            </w:r>
-            <w:proofErr w:type="spellEnd"/>
-            <w:r>
-              <w:t>;</w:t>
+            <w:r>
+              <w:t>PSA_low;</w:t>
             </w:r>
             <w:r>
               <w:t xml:space="preserve"> </w:t>
             </w:r>
-            <w:proofErr w:type="spellStart"/>
-            <w:r>
-              <w:t>PSA_high</w:t>
-            </w:r>
-            <w:proofErr w:type="spellEnd"/>
-            <w:r>
-              <w:t>;</w:t>
+            <w:r>
+              <w:t>PSA_high;</w:t>
             </w:r>
             <w:r>
               <w:t xml:space="preserve"> </w:t>
@@ -4962,46 +4594,26 @@
             <w:r>
               <w:t xml:space="preserve"> </w:t>
             </w:r>
-            <w:proofErr w:type="spellStart"/>
-            <w:r>
-              <w:t>DSA_flag</w:t>
-            </w:r>
-            <w:proofErr w:type="spellEnd"/>
-            <w:r>
-              <w:t>;</w:t>
+            <w:r>
+              <w:t>DSA_flag;</w:t>
             </w:r>
             <w:r>
               <w:t xml:space="preserve"> </w:t>
             </w:r>
-            <w:proofErr w:type="spellStart"/>
-            <w:r>
-              <w:t>DSA_low</w:t>
-            </w:r>
-            <w:proofErr w:type="spellEnd"/>
-            <w:r>
-              <w:t>;</w:t>
+            <w:r>
+              <w:t>DSA_low;</w:t>
             </w:r>
             <w:r>
               <w:t xml:space="preserve"> </w:t>
             </w:r>
-            <w:proofErr w:type="spellStart"/>
-            <w:r>
-              <w:t>DSA_high</w:t>
-            </w:r>
-            <w:proofErr w:type="spellEnd"/>
-            <w:r>
-              <w:t>;</w:t>
+            <w:r>
+              <w:t>DSA_high;</w:t>
             </w:r>
             <w:r>
               <w:t xml:space="preserve"> </w:t>
             </w:r>
-            <w:proofErr w:type="spellStart"/>
-            <w:r>
-              <w:t>mrs</w:t>
-            </w:r>
-            <w:proofErr w:type="spellEnd"/>
-            <w:r>
-              <w:t>;</w:t>
+            <w:r>
+              <w:t>mrs;</w:t>
             </w:r>
             <w:r>
               <w:t xml:space="preserve"> </w:t>
@@ -5170,15 +4782,7 @@
           </w:tcPr>
           <w:p>
             <w:r>
-              <w:t xml:space="preserve">ISDN (integrated stroke network name, e.g. London), site.name (hospital site name, e.g. Barking, Havering and Redbridge University Hospitals NHS Trust), Hospital (e.g. Queens Hospital Romford HASU), date (date range for stroke recordings), </w:t>
-            </w:r>
-            <w:proofErr w:type="spellStart"/>
-            <w:r>
-              <w:t>n.stroke</w:t>
-            </w:r>
-            <w:proofErr w:type="spellEnd"/>
-            <w:r>
-              <w:t xml:space="preserve"> (number of strokes recorded at that hospital for the stated time frame)</w:t>
+              <w:t>ISDN (integrated stroke network name, e.g. London), site.name (hospital site name, e.g. Barking, Havering and Redbridge University Hospitals NHS Trust), Hospital (e.g. Queens Hospital Romford HASU), date (date range for stroke recordings), n.stroke (number of strokes recorded at that hospital for the stated time frame)</w:t>
             </w:r>
           </w:p>
         </w:tc>
@@ -5267,15 +4871,7 @@
         <w:divId w:val="860977169"/>
       </w:pPr>
       <w:r>
-        <w:t>These are the input csv files needed to run the model. These are used, by the model code, to create inputs which feed into the "</w:t>
-      </w:r>
-      <w:proofErr w:type="spellStart"/>
-      <w:r>
-        <w:t>created_inputs</w:t>
-      </w:r>
-      <w:proofErr w:type="spellEnd"/>
-      <w:r>
-        <w:t>" subfolder.</w:t>
+        <w:t>These are the input csv files needed to run the model. These are used, by the model code, to create inputs which feed into the "created_inputs" subfolder.</w:t>
       </w:r>
     </w:p>
     <w:p>
@@ -5396,11 +4992,9 @@
         </w:rPr>
         <w:t>─</w:t>
       </w:r>
-      <w:proofErr w:type="spellStart"/>
       <w:r>
         <w:t>model_code</w:t>
       </w:r>
-      <w:proofErr w:type="spellEnd"/>
       <w:r>
         <w:t>/</w:t>
       </w:r>
@@ -5425,15 +5019,91 @@
         <w:t>─</w:t>
       </w:r>
       <w:r>
+        <w:t xml:space="preserve"> model_functions.R                 # core acute-tree + long-term Markov model</w:t>
+      </w:r>
+    </w:p>
+    <w:p>
+      <w:pPr>
+        <w:divId w:val="860977169"/>
+      </w:pPr>
+      <w:r>
+        <w:t xml:space="preserve">│  </w:t>
+      </w:r>
+      <w:r>
+        <w:rPr>
+          <w:rFonts w:ascii="MS Gothic" w:eastAsia="MS Gothic" w:hAnsi="MS Gothic" w:cs="MS Gothic" w:hint="eastAsia"/>
+        </w:rPr>
+        <w:t>├</w:t>
+      </w:r>
+      <w:r>
+        <w:rPr>
+          <w:rFonts w:cs="Aptos"/>
+        </w:rPr>
+        <w:t>─</w:t>
+      </w:r>
+      <w:r>
+        <w:t xml:space="preserve"> model_functions_mortality_sc.R    # scenario variant (mortality RR year 1)</w:t>
+      </w:r>
+    </w:p>
+    <w:p>
+      <w:pPr>
+        <w:divId w:val="860977169"/>
+      </w:pPr>
+      <w:r>
+        <w:t xml:space="preserve">│  </w:t>
+      </w:r>
+      <w:r>
+        <w:rPr>
+          <w:rFonts w:ascii="MS Gothic" w:eastAsia="MS Gothic" w:hAnsi="MS Gothic" w:cs="MS Gothic" w:hint="eastAsia"/>
+        </w:rPr>
+        <w:t>├</w:t>
+      </w:r>
+      <w:r>
+        <w:rPr>
+          <w:rFonts w:cs="Aptos"/>
+        </w:rPr>
+        <w:t>─</w:t>
+      </w:r>
+      <w:r>
+        <w:t xml:space="preserve"> m</w:t>
+      </w:r>
+      <w:r>
+        <w:t>odel_functions_MTIVT_sc</w:t>
+      </w:r>
+      <w:r>
+        <w:t>.R        # scenario variant (additive LT effects)</w:t>
+      </w:r>
+    </w:p>
+    <w:p>
+      <w:pPr>
+        <w:divId w:val="860977169"/>
+      </w:pPr>
+      <w:r>
+        <w:t xml:space="preserve">│  </w:t>
+      </w:r>
+      <w:r>
+        <w:rPr>
+          <w:rFonts w:ascii="MS Gothic" w:eastAsia="MS Gothic" w:hAnsi="MS Gothic" w:cs="MS Gothic" w:hint="eastAsia"/>
+        </w:rPr>
+        <w:t>├</w:t>
+      </w:r>
+      <w:r>
+        <w:rPr>
+          <w:rFonts w:cs="Aptos"/>
+        </w:rPr>
+        <w:t>─</w:t>
+      </w:r>
+      <w:r>
         <w:t xml:space="preserve"> </w:t>
       </w:r>
-      <w:proofErr w:type="spellStart"/>
-      <w:r>
-        <w:t>model_functions.R</w:t>
-      </w:r>
-      <w:proofErr w:type="spellEnd"/>
-      <w:r>
-        <w:t xml:space="preserve">                 # core acute-tree + long-term Markov model</w:t>
+      <w:r>
+        <w:t xml:space="preserve">model_functions_hcc.R </w:t>
+      </w:r>
+      <w:r>
+        <w:t>#</w:t>
+      </w:r>
+      <w:r>
+        <w:t xml:space="preserve"> half-cycle correction variant </w:t>
       </w:r>
     </w:p>
     <w:p>
@@ -5456,52 +5126,13 @@
         <w:t>─</w:t>
       </w:r>
       <w:r>
-        <w:t xml:space="preserve"> </w:t>
-      </w:r>
-      <w:proofErr w:type="spellStart"/>
-      <w:r>
-        <w:t>model_functions_mortality_sc.R</w:t>
-      </w:r>
-      <w:proofErr w:type="spellEnd"/>
-      <w:r>
-        <w:t xml:space="preserve">    # scenario variant (mortality RR year 1)</w:t>
-      </w:r>
-    </w:p>
-    <w:p>
-      <w:pPr>
-        <w:divId w:val="860977169"/>
-      </w:pPr>
-      <w:r>
-        <w:t xml:space="preserve">│  </w:t>
-      </w:r>
-      <w:r>
-        <w:rPr>
-          <w:rFonts w:ascii="MS Gothic" w:eastAsia="MS Gothic" w:hAnsi="MS Gothic" w:cs="MS Gothic" w:hint="eastAsia"/>
-        </w:rPr>
-        <w:t>├</w:t>
-      </w:r>
-      <w:r>
-        <w:rPr>
-          <w:rFonts w:cs="Aptos"/>
-        </w:rPr>
-        <w:t>─</w:t>
-      </w:r>
-      <w:r>
-        <w:t xml:space="preserve"> </w:t>
-      </w:r>
-      <w:proofErr w:type="spellStart"/>
-      <w:r>
-        <w:t>m</w:t>
-      </w:r>
-      <w:r>
-        <w:t>odel_functions_MTIVT_sc</w:t>
-      </w:r>
-      <w:r>
-        <w:t>.R</w:t>
-      </w:r>
-      <w:proofErr w:type="spellEnd"/>
-      <w:r>
-        <w:t xml:space="preserve">        # scenario variant (additive LT effects)</w:t>
+        <w:t xml:space="preserve">model_functions_mortality_gradual_sc.R </w:t>
+      </w:r>
+      <w:r>
+        <w:t xml:space="preserve"># </w:t>
+      </w:r>
+      <w:r>
+        <w:t xml:space="preserve">gradual mortality attenuation variant </w:t>
       </w:r>
     </w:p>
     <w:p>
@@ -5644,9 +5275,6 @@
         </w:rPr>
       </w:pPr>
       <w:r>
-        <w:rPr>
-          <w:lang w:val="it-IT"/>
-        </w:rPr>
         <w:t xml:space="preserve">│  </w:t>
       </w:r>
       <w:r>
@@ -5669,6 +5297,12 @@
         </w:rPr>
         <w:t xml:space="preserve"> 4_scenario_analysis.R             # scenario analyses</w:t>
       </w:r>
+      <w:r>
+        <w:rPr>
+          <w:lang w:val="it-IT"/>
+        </w:rPr>
+        <w:t xml:space="preserve"> (covers 8 scenarios currently)</w:t>
+      </w:r>
     </w:p>
     <w:p>
       <w:pPr>
@@ -5692,11 +5326,67 @@
       <w:r>
         <w:t xml:space="preserve"> </w:t>
       </w:r>
-      <w:proofErr w:type="spellStart"/>
-      <w:r>
-        <w:t>regional_level.R</w:t>
-      </w:r>
-      <w:proofErr w:type="spellEnd"/>
+      <w:r>
+        <w:t xml:space="preserve">5_manuscript_tables.R </w:t>
+      </w:r>
+      <w:r>
+        <w:t xml:space="preserve"> #</w:t>
+      </w:r>
+      <w:r>
+        <w:t xml:space="preserve"> generates Table 3 and Table 4 CSVs for the manuscript</w:t>
+      </w:r>
+    </w:p>
+    <w:p>
+      <w:pPr>
+        <w:divId w:val="860977169"/>
+      </w:pPr>
+      <w:r>
+        <w:t xml:space="preserve">│  </w:t>
+      </w:r>
+      <w:r>
+        <w:rPr>
+          <w:rFonts w:ascii="MS Gothic" w:eastAsia="MS Gothic" w:hAnsi="MS Gothic" w:cs="MS Gothic" w:hint="eastAsia"/>
+        </w:rPr>
+        <w:t>├</w:t>
+      </w:r>
+      <w:r>
+        <w:rPr>
+          <w:rFonts w:cs="Aptos"/>
+        </w:rPr>
+        <w:t>─</w:t>
+      </w:r>
+      <w:r>
+        <w:t xml:space="preserve">6_model_testing.R </w:t>
+      </w:r>
+      <w:r>
+        <w:t xml:space="preserve">    #</w:t>
+      </w:r>
+      <w:r>
+        <w:t xml:space="preserve"> NICE HTA Lab 14-point validation test suite</w:t>
+      </w:r>
+    </w:p>
+    <w:p>
+      <w:pPr>
+        <w:divId w:val="860977169"/>
+      </w:pPr>
+      <w:r>
+        <w:t xml:space="preserve">│  </w:t>
+      </w:r>
+      <w:r>
+        <w:rPr>
+          <w:rFonts w:ascii="MS Gothic" w:eastAsia="MS Gothic" w:hAnsi="MS Gothic" w:cs="MS Gothic" w:hint="eastAsia"/>
+        </w:rPr>
+        <w:t>├</w:t>
+      </w:r>
+      <w:r>
+        <w:rPr>
+          <w:rFonts w:cs="Aptos"/>
+        </w:rPr>
+        <w:t>─</w:t>
+      </w:r>
+      <w:r>
+        <w:t xml:space="preserve"> regional_level.R</w:t>
+      </w:r>
       <w:r>
         <w:t xml:space="preserve">            # ISDN-level analysis</w:t>
       </w:r>
@@ -5723,11 +5413,9 @@
       <w:r>
         <w:t xml:space="preserve"> </w:t>
       </w:r>
-      <w:proofErr w:type="spellStart"/>
       <w:r>
         <w:t>local_level.R</w:t>
       </w:r>
-      <w:proofErr w:type="spellEnd"/>
       <w:r>
         <w:t xml:space="preserve">            # hospital-level analysis</w:t>
       </w:r>
@@ -5752,27 +5440,13 @@
         <w:rPr>
           <w:rFonts w:cs="Aptos"/>
         </w:rPr>
-        <w:t>─</w:t>
-      </w:r>
-      <w:proofErr w:type="spellStart"/>
+        <w:t>─figure</w:t>
+      </w:r>
       <w:r>
         <w:rPr>
           <w:rFonts w:cs="Aptos"/>
         </w:rPr>
-        <w:t>figure</w:t>
-      </w:r>
-      <w:r>
-        <w:rPr>
-          <w:rFonts w:cs="Aptos"/>
-        </w:rPr>
-        <w:t>_creation</w:t>
-      </w:r>
-      <w:proofErr w:type="spellEnd"/>
-      <w:r>
-        <w:rPr>
-          <w:rFonts w:cs="Aptos"/>
-        </w:rPr>
-        <w:t>/ [contains R scripts creating figures]</w:t>
+        <w:t>_creation/ [contains R scripts creating figures]</w:t>
       </w:r>
     </w:p>
     <w:p>
@@ -5932,15 +5606,7 @@
         <w:divId w:val="860977169"/>
       </w:pPr>
       <w:r>
-        <w:t xml:space="preserve">Dates: The ISDN datasets include a date label such as "Apr 2022–Mar 2023". Retain this exact format (month name plus year range, using a consistent </w:t>
-      </w:r>
-      <w:proofErr w:type="spellStart"/>
-      <w:r>
-        <w:t>en</w:t>
-      </w:r>
-      <w:proofErr w:type="spellEnd"/>
-      <w:r>
-        <w:t>-dash or hyphen). If you use a different period label, update the filter in the script accordingly.</w:t>
+        <w:t>Dates: The ISDN datasets include a date label such as "Apr 2022–Mar 2023". Retain this exact format (month name plus year range, using a consistent en-dash or hyphen). If you use a different period label, update the filter in the script accordingly.</w:t>
       </w:r>
     </w:p>
     <w:p>
@@ -5979,6 +5645,7 @@
         <w:divId w:val="860977169"/>
       </w:pPr>
       <w:r>
+        <w:lastRenderedPageBreak/>
         <w:t>Region filtering: ISDN values "Wales" and "Northern Ireland" are excluded. Use these exact strings if you intend to drop those records.</w:t>
       </w:r>
     </w:p>
@@ -6031,7 +5698,6 @@
         <w:divId w:val="860977169"/>
       </w:pPr>
       <w:r>
-        <w:lastRenderedPageBreak/>
         <w:t>If your HASU naming convention differs, adjust the "HASU" pattern in the script.</w:t>
       </w:r>
     </w:p>
@@ -6127,37 +5793,13 @@
         <w:t xml:space="preserve">Utilities (by mRS): truncated normal on [0,1] from mean </w:t>
       </w:r>
       <w:r>
-        <w:t>(</w:t>
-      </w:r>
-      <w:proofErr w:type="spellStart"/>
-      <w:r>
-        <w:t>base_case</w:t>
-      </w:r>
-      <w:proofErr w:type="spellEnd"/>
-      <w:r>
-        <w:t xml:space="preserve">) </w:t>
+        <w:t xml:space="preserve">(base_case) </w:t>
       </w:r>
       <w:r>
         <w:t>+ 95% CI</w:t>
       </w:r>
       <w:r>
-        <w:t xml:space="preserve"> (</w:t>
-      </w:r>
-      <w:proofErr w:type="spellStart"/>
-      <w:r>
-        <w:t>PSA_low</w:t>
-      </w:r>
-      <w:proofErr w:type="spellEnd"/>
-      <w:r>
-        <w:t xml:space="preserve"> and </w:t>
-      </w:r>
-      <w:proofErr w:type="spellStart"/>
-      <w:r>
-        <w:t>PSA_high</w:t>
-      </w:r>
-      <w:proofErr w:type="spellEnd"/>
-      <w:r>
-        <w:t>)</w:t>
+        <w:t xml:space="preserve"> (PSA_low and PSA_high)</w:t>
       </w:r>
     </w:p>
     <w:p>
@@ -6173,31 +5815,7 @@
         <w:t xml:space="preserve">Costs: gamma fit </w:t>
       </w:r>
       <w:r>
-        <w:t>from mean (</w:t>
-      </w:r>
-      <w:proofErr w:type="spellStart"/>
-      <w:r>
-        <w:t>base_case</w:t>
-      </w:r>
-      <w:proofErr w:type="spellEnd"/>
-      <w:r>
-        <w:t>) + 95% CI (</w:t>
-      </w:r>
-      <w:proofErr w:type="spellStart"/>
-      <w:r>
-        <w:t>PSA_low</w:t>
-      </w:r>
-      <w:proofErr w:type="spellEnd"/>
-      <w:r>
-        <w:t xml:space="preserve"> and </w:t>
-      </w:r>
-      <w:proofErr w:type="spellStart"/>
-      <w:r>
-        <w:t>PSA_high</w:t>
-      </w:r>
-      <w:proofErr w:type="spellEnd"/>
-      <w:r>
-        <w:t>)</w:t>
+        <w:t>from mean (base_case) + 95% CI (PSA_low and PSA_high)</w:t>
       </w:r>
     </w:p>
     <w:p>
@@ -6213,31 +5831,7 @@
         <w:t xml:space="preserve">RR mortality (by mRS): lognormal </w:t>
       </w:r>
       <w:r>
-        <w:t>from mean (</w:t>
-      </w:r>
-      <w:proofErr w:type="spellStart"/>
-      <w:r>
-        <w:t>base_case</w:t>
-      </w:r>
-      <w:proofErr w:type="spellEnd"/>
-      <w:r>
-        <w:t>) + 95% CI (</w:t>
-      </w:r>
-      <w:proofErr w:type="spellStart"/>
-      <w:r>
-        <w:t>PSA_low</w:t>
-      </w:r>
-      <w:proofErr w:type="spellEnd"/>
-      <w:r>
-        <w:t xml:space="preserve"> and </w:t>
-      </w:r>
-      <w:proofErr w:type="spellStart"/>
-      <w:r>
-        <w:t>PSA_high</w:t>
-      </w:r>
-      <w:proofErr w:type="spellEnd"/>
-      <w:r>
-        <w:t>)</w:t>
+        <w:t>from mean (base_case) + 95% CI (PSA_low and PSA_high)</w:t>
       </w:r>
     </w:p>
     <w:p>
@@ -6250,15 +5844,7 @@
         <w:divId w:val="860977169"/>
       </w:pPr>
       <w:r>
-        <w:t xml:space="preserve">Control probabilities: Beta(mean, k) — here k is stored in the parameter file under </w:t>
-      </w:r>
-      <w:proofErr w:type="spellStart"/>
-      <w:r>
-        <w:t>PSA_low</w:t>
-      </w:r>
-      <w:proofErr w:type="spellEnd"/>
-      <w:r>
-        <w:t xml:space="preserve"> for Beta rows (not a CI bound).</w:t>
+        <w:t>Control probabilities: Beta(mean, k) — here k is stored in the parameter file under PSA_low for Beta rows (not a CI bound).</w:t>
       </w:r>
     </w:p>
     <w:p>
@@ -6277,31 +5863,7 @@
         <w:t xml:space="preserve">: </w:t>
       </w:r>
       <w:r>
-        <w:t>Intervention-arm probabilities are derived from control probabilities and sampled ORs using the standard odds transformation (</w:t>
-      </w:r>
-      <w:proofErr w:type="spellStart"/>
-      <w:r>
-        <w:t>p_treat</w:t>
-      </w:r>
-      <w:proofErr w:type="spellEnd"/>
-      <w:r>
-        <w:t xml:space="preserve"> = OR * </w:t>
-      </w:r>
-      <w:proofErr w:type="spellStart"/>
-      <w:r>
-        <w:t>odds_control</w:t>
-      </w:r>
-      <w:proofErr w:type="spellEnd"/>
-      <w:r>
-        <w:t xml:space="preserve"> / (1 + OR * </w:t>
-      </w:r>
-      <w:proofErr w:type="spellStart"/>
-      <w:r>
-        <w:t>odds_control</w:t>
-      </w:r>
-      <w:proofErr w:type="spellEnd"/>
-      <w:r>
-        <w:t xml:space="preserve">)), with </w:t>
+        <w:t xml:space="preserve">Intervention-arm probabilities are derived from control probabilities and sampled ORs using the standard odds transformation (p_treat = OR * odds_control / (1 + OR * odds_control)), with </w:t>
       </w:r>
       <w:r>
         <w:t>bounds</w:t>
@@ -6326,15 +5888,7 @@
         <w:t xml:space="preserve">: </w:t>
       </w:r>
       <w:r>
-        <w:t>The PSA creates full sample sets for utilities, costs, and mortality by mRS; deterministic values used by the base model come directly from the parameter file (</w:t>
-      </w:r>
-      <w:proofErr w:type="spellStart"/>
-      <w:r>
-        <w:t>base_case</w:t>
-      </w:r>
-      <w:proofErr w:type="spellEnd"/>
-      <w:r>
-        <w:t>), not from PSA medians.</w:t>
+        <w:t>The PSA creates full sample sets for utilities, costs, and mortality by mRS; deterministic values used by the base model come directly from the parameter file (base_case), not from PSA medians.</w:t>
       </w:r>
     </w:p>
     <w:p>
@@ -6353,18 +5907,10 @@
         <w:t xml:space="preserve">: </w:t>
       </w:r>
       <w:r>
-        <w:t xml:space="preserve">mRS is treated as an integer key (0–6) across parameter files and PSA </w:t>
-      </w:r>
-      <w:proofErr w:type="spellStart"/>
-      <w:r>
-        <w:t>outputs</w:t>
-      </w:r>
-      <w:r>
-        <w:t>Utilities</w:t>
-      </w:r>
-      <w:proofErr w:type="spellEnd"/>
-      <w:r>
-        <w:t xml:space="preserve"> and costs for mRS 6 are set to 0; RR for mRS 6 is NA (dead state, not used). Ensure your parameter file has mRS recorded as integers 0–6.</w:t>
+        <w:t>mRS is treated as an integer key (0–6) across parameter files and PSA outputs</w:t>
+      </w:r>
+      <w:r>
+        <w:t>Utilities and costs for mRS 6 are set to 0; RR for mRS 6 is NA (dead state, not used). Ensure your parameter file has mRS recorded as integers 0–6.</w:t>
       </w:r>
     </w:p>
     <w:p>
@@ -6409,21 +5955,8 @@
       <w:r>
         <w:t xml:space="preserve"> </w:t>
       </w:r>
-      <w:proofErr w:type="spellStart"/>
-      <w:r>
-        <w:t>low.results</w:t>
-      </w:r>
-      <w:proofErr w:type="spellEnd"/>
-      <w:r>
-        <w:t>[[</w:t>
-      </w:r>
-      <w:proofErr w:type="spellStart"/>
-      <w:r>
-        <w:t>variable_name</w:t>
-      </w:r>
-      <w:proofErr w:type="spellEnd"/>
-      <w:r>
-        <w:t>]] &lt;- result</w:t>
+      <w:r>
+        <w:t>low.results[[variable_name]] &lt;- result</w:t>
       </w:r>
     </w:p>
     <w:p>
@@ -6445,6 +5978,7 @@
         <w:rPr>
           <w:rFonts w:asciiTheme="minorHAnsi" w:hAnsiTheme="minorHAnsi"/>
         </w:rPr>
+        <w:lastRenderedPageBreak/>
         <w:t>3</w:t>
       </w:r>
       <w:r>
@@ -6480,345 +6014,581 @@
     </w:p>
     <w:p>
       <w:pPr>
-        <w:pStyle w:val="ListBullet"/>
-        <w:tabs>
-          <w:tab w:val="num" w:pos="360"/>
-        </w:tabs>
-        <w:ind w:left="360" w:hanging="360"/>
-        <w:divId w:val="860977169"/>
-      </w:pPr>
-      <w:r>
+        <w:pStyle w:val="ListParagraph"/>
+        <w:numPr>
+          <w:ilvl w:val="0"/>
+          <w:numId w:val="35"/>
+        </w:numPr>
+        <w:spacing w:after="100" w:line="240" w:lineRule="auto"/>
+        <w:contextualSpacing w:val="0"/>
+        <w:divId w:val="860977169"/>
+      </w:pPr>
+      <w:r>
+        <w:rPr>
+          <w:rFonts w:eastAsia="Calibri" w:cs="Calibri"/>
+          <w:b/>
+          <w:bCs/>
+        </w:rPr>
         <w:t>Core base-case bundle (from 3a_deterministic_model.R):</w:t>
       </w:r>
     </w:p>
     <w:p>
       <w:pPr>
-        <w:spacing w:after="0"/>
-        <w:divId w:val="860977169"/>
-      </w:pPr>
-      <w:r>
-        <w:t>- outputs/</w:t>
-      </w:r>
-      <w:proofErr w:type="spellStart"/>
-      <w:r>
-        <w:t>base_case_results.RData</w:t>
-      </w:r>
-      <w:proofErr w:type="spellEnd"/>
-      <w:r>
-        <w:t xml:space="preserve"> → contains </w:t>
-      </w:r>
-      <w:proofErr w:type="spellStart"/>
-      <w:r>
-        <w:t>base_case</w:t>
-      </w:r>
-      <w:proofErr w:type="spellEnd"/>
-      <w:r>
-        <w:t>, a list with:</w:t>
-      </w:r>
-      <w:r>
-        <w:br/>
-        <w:t xml:space="preserve">  - </w:t>
-      </w:r>
-      <w:proofErr w:type="spellStart"/>
-      <w:r>
-        <w:t>summary_data_all</w:t>
-      </w:r>
-      <w:proofErr w:type="spellEnd"/>
-      <w:r>
-        <w:t>: totals by strategy (costs, QALYs)</w:t>
-      </w:r>
-      <w:r>
-        <w:br/>
-      </w:r>
-      <w:r>
+        <w:pStyle w:val="ListParagraph"/>
+        <w:numPr>
+          <w:ilvl w:val="0"/>
+          <w:numId w:val="36"/>
+        </w:numPr>
+        <w:spacing w:after="60" w:line="240" w:lineRule="auto"/>
+        <w:contextualSpacing w:val="0"/>
+        <w:divId w:val="860977169"/>
+      </w:pPr>
+      <w:r>
+        <w:rPr>
+          <w:rFonts w:eastAsia="Calibri" w:cs="Calibri"/>
+        </w:rPr>
+        <w:t>outputs/base_case_results.RData → contains base_case, a list with:</w:t>
+      </w:r>
+    </w:p>
+    <w:p>
+      <w:pPr>
+        <w:spacing w:after="40"/>
+        <w:ind w:left="1440"/>
+        <w:divId w:val="860977169"/>
+      </w:pPr>
+      <w:r>
+        <w:rPr>
+          <w:rFonts w:eastAsia="Calibri" w:cs="Calibri"/>
+        </w:rPr>
+        <w:t xml:space="preserve">  • summary_data_all: totals by strategy (costs, QALYs)</w:t>
+      </w:r>
+    </w:p>
+    <w:p>
+      <w:pPr>
+        <w:spacing w:after="40"/>
+        <w:ind w:left="1440"/>
+        <w:divId w:val="860977169"/>
+      </w:pPr>
+      <w:r>
+        <w:rPr>
+          <w:rFonts w:eastAsia="Calibri" w:cs="Calibri"/>
+        </w:rPr>
+        <w:t xml:space="preserve">  • incremental_results: key incremental outcomes and Net Monetary Benefit (NMB)</w:t>
+      </w:r>
+    </w:p>
+    <w:p>
+      <w:pPr>
+        <w:spacing w:after="40"/>
+        <w:ind w:left="1440"/>
+        <w:divId w:val="860977169"/>
+      </w:pPr>
+      <w:r>
+        <w:rPr>
+          <w:rFonts w:eastAsia="Calibri" w:cs="Calibri"/>
+        </w:rPr>
+        <w:t xml:space="preserve">  • process_results: pathway/process counts and component costs/QALYs</w:t>
+      </w:r>
+    </w:p>
+    <w:p>
+      <w:pPr>
+        <w:spacing w:after="40"/>
+        <w:ind w:left="1440"/>
+        <w:divId w:val="860977169"/>
+      </w:pPr>
+      <w:r>
+        <w:rPr>
+          <w:rFonts w:eastAsia="Calibri" w:cs="Calibri"/>
+        </w:rPr>
+        <w:t xml:space="preserve">  • mrs.trace: Markov trace (mRS0–mRS6 over cycles)</w:t>
+      </w:r>
+    </w:p>
+    <w:p>
+      <w:pPr>
+        <w:spacing w:after="40"/>
+        <w:ind w:left="1440"/>
+        <w:divId w:val="860977169"/>
+      </w:pPr>
+      <w:r>
+        <w:rPr>
+          <w:rFonts w:eastAsia="Calibri" w:cs="Calibri"/>
+        </w:rPr>
+        <w:t xml:space="preserve">  • trace.standard / trace.intervention: decision-tree traces</w:t>
+      </w:r>
+    </w:p>
+    <w:p>
+      <w:pPr>
+        <w:spacing w:after="40"/>
+        <w:ind w:left="1440"/>
+        <w:divId w:val="860977169"/>
+      </w:pPr>
+      <w:r>
+        <w:rPr>
+          <w:rFonts w:eastAsia="Calibri" w:cs="Calibri"/>
+        </w:rPr>
+        <w:t xml:space="preserve">  • tm.standard / tm.intervention: transition arrays (per cycle)</w:t>
+      </w:r>
+    </w:p>
+    <w:p>
+      <w:pPr>
+        <w:pStyle w:val="ListParagraph"/>
+        <w:numPr>
+          <w:ilvl w:val="0"/>
+          <w:numId w:val="36"/>
+        </w:numPr>
+        <w:spacing w:after="60" w:line="240" w:lineRule="auto"/>
+        <w:contextualSpacing w:val="0"/>
+        <w:divId w:val="860977169"/>
+      </w:pPr>
+      <w:r>
+        <w:rPr>
+          <w:rFonts w:eastAsia="Calibri" w:cs="Calibri"/>
+        </w:rPr>
+        <w:t>Convenience CSVs: population_results.csv, NMB.csv, proc_results.csv, mrstrace_results.csv</w:t>
+      </w:r>
+    </w:p>
+    <w:p>
+      <w:pPr>
+        <w:pStyle w:val="ListParagraph"/>
+        <w:numPr>
+          <w:ilvl w:val="0"/>
+          <w:numId w:val="36"/>
+        </w:numPr>
+        <w:spacing w:after="60" w:line="240" w:lineRule="auto"/>
+        <w:contextualSpacing w:val="0"/>
+        <w:divId w:val="860977169"/>
+      </w:pPr>
+      <w:r>
+        <w:rPr>
+          <w:rFonts w:eastAsia="Calibri" w:cs="Calibri"/>
+        </w:rPr>
+        <w:t>DSA_results: results from the deterministic sensitivity analysis</w:t>
+      </w:r>
+    </w:p>
+    <w:p>
+      <w:pPr>
+        <w:pStyle w:val="ListParagraph"/>
+        <w:numPr>
+          <w:ilvl w:val="0"/>
+          <w:numId w:val="36"/>
+        </w:numPr>
+        <w:spacing w:after="60" w:line="240" w:lineRule="auto"/>
+        <w:contextualSpacing w:val="0"/>
+        <w:divId w:val="860977169"/>
+        <w:rPr>
+          <w:lang w:val="it-IT"/>
+        </w:rPr>
+      </w:pPr>
+      <w:r>
+        <w:rPr>
+          <w:rFonts w:eastAsia="Calibri" w:cs="Calibri"/>
+          <w:lang w:val="it-IT"/>
+        </w:rPr>
+        <w:t>scenario_incremental_results.csv: scenario results</w:t>
+      </w:r>
+    </w:p>
+    <w:p>
+      <w:pPr>
+        <w:pStyle w:val="ListParagraph"/>
+        <w:numPr>
+          <w:ilvl w:val="0"/>
+          <w:numId w:val="36"/>
+        </w:numPr>
+        <w:spacing w:after="60" w:line="240" w:lineRule="auto"/>
+        <w:contextualSpacing w:val="0"/>
+        <w:divId w:val="860977169"/>
+      </w:pPr>
+      <w:r>
+        <w:rPr>
+          <w:rFonts w:eastAsia="Calibri" w:cs="Calibri"/>
+        </w:rPr>
+        <w:t>scenario_process_results.csv: process-level results (procedure volumes, costs, QALYs) for each scenario (from 4_scenario_analysis.R)</w:t>
+      </w:r>
+    </w:p>
+    <w:p>
+      <w:pPr>
+        <w:pStyle w:val="ListParagraph"/>
+        <w:numPr>
+          <w:ilvl w:val="0"/>
+          <w:numId w:val="36"/>
+        </w:numPr>
+        <w:spacing w:after="200" w:line="240" w:lineRule="auto"/>
+        <w:contextualSpacing w:val="0"/>
+        <w:divId w:val="860977169"/>
+      </w:pPr>
+      <w:r>
+        <w:rPr>
+          <w:rFonts w:eastAsia="Calibri" w:cs="Calibri"/>
+        </w:rPr>
+        <w:t>dsa_plot_data.csv: exported tornado plot data for the top parameters in the DSA (from fig_DSA.R)</w:t>
+      </w:r>
+    </w:p>
+    <w:p>
+      <w:pPr>
+        <w:pStyle w:val="ListParagraph"/>
+        <w:numPr>
+          <w:ilvl w:val="0"/>
+          <w:numId w:val="35"/>
+        </w:numPr>
+        <w:spacing w:after="100" w:line="240" w:lineRule="auto"/>
+        <w:contextualSpacing w:val="0"/>
+        <w:divId w:val="860977169"/>
+      </w:pPr>
+      <w:r>
+        <w:rPr>
+          <w:rFonts w:eastAsia="Calibri" w:cs="Calibri"/>
+          <w:b/>
+          <w:bCs/>
+        </w:rPr>
+        <w:t>Regional &amp; local aggregation:</w:t>
+      </w:r>
+    </w:p>
+    <w:p>
+      <w:pPr>
+        <w:pStyle w:val="ListParagraph"/>
+        <w:numPr>
+          <w:ilvl w:val="0"/>
+          <w:numId w:val="36"/>
+        </w:numPr>
+        <w:spacing w:after="60" w:line="240" w:lineRule="auto"/>
+        <w:contextualSpacing w:val="0"/>
+        <w:divId w:val="860977169"/>
+      </w:pPr>
+      <w:r>
+        <w:rPr>
+          <w:rFonts w:eastAsia="Calibri" w:cs="Calibri"/>
+        </w:rPr>
+        <w:t>outputs/network_results.RData (ISDN-level list of model results) and outputs/ISDN_incremental_results.csv</w:t>
+      </w:r>
+    </w:p>
+    <w:p>
+      <w:pPr>
+        <w:pStyle w:val="ListParagraph"/>
+        <w:numPr>
+          <w:ilvl w:val="0"/>
+          <w:numId w:val="36"/>
+        </w:numPr>
+        <w:spacing w:after="200" w:line="240" w:lineRule="auto"/>
+        <w:contextualSpacing w:val="0"/>
+        <w:divId w:val="860977169"/>
+      </w:pPr>
+      <w:r>
+        <w:rPr>
+          <w:rFonts w:eastAsia="Calibri" w:cs="Calibri"/>
+        </w:rPr>
+        <w:t>outputs/hospital_results.RData (hospital-level list of model results) and outputs/hospital_incremental_results.csv</w:t>
+      </w:r>
+    </w:p>
+    <w:p>
+      <w:pPr>
+        <w:pStyle w:val="ListParagraph"/>
+        <w:numPr>
+          <w:ilvl w:val="0"/>
+          <w:numId w:val="35"/>
+        </w:numPr>
+        <w:spacing w:after="100" w:line="240" w:lineRule="auto"/>
+        <w:contextualSpacing w:val="0"/>
+        <w:divId w:val="860977169"/>
+      </w:pPr>
+      <w:r>
+        <w:rPr>
+          <w:rFonts w:eastAsia="Calibri" w:cs="Calibri"/>
+          <w:b/>
+          <w:bCs/>
+        </w:rPr>
+        <w:t>Probabilistic Sensitivity Analysis (PSA):</w:t>
+      </w:r>
+    </w:p>
+    <w:p>
+      <w:pPr>
+        <w:pStyle w:val="ListParagraph"/>
+        <w:numPr>
+          <w:ilvl w:val="0"/>
+          <w:numId w:val="36"/>
+        </w:numPr>
+        <w:spacing w:after="60" w:line="240" w:lineRule="auto"/>
+        <w:contextualSpacing w:val="0"/>
+        <w:divId w:val="860977169"/>
+      </w:pPr>
+      <w:r>
+        <w:rPr>
+          <w:rFonts w:eastAsia="Calibri" w:cs="Calibri"/>
+        </w:rPr>
+        <w:t>outputs/psa_outputs.csv: per-simulation totals (costs/QALYs by arm) plus incremental values</w:t>
+      </w:r>
+    </w:p>
+    <w:p>
+      <w:pPr>
+        <w:pStyle w:val="ListParagraph"/>
+        <w:numPr>
+          <w:ilvl w:val="0"/>
+          <w:numId w:val="36"/>
+        </w:numPr>
+        <w:spacing w:after="60" w:line="240" w:lineRule="auto"/>
+        <w:contextualSpacing w:val="0"/>
+        <w:divId w:val="860977169"/>
+      </w:pPr>
+      <w:r>
+        <w:rPr>
+          <w:rFonts w:eastAsia="Calibri" w:cs="Calibri"/>
+        </w:rPr>
+        <w:t>outputs/CEAC.long.csv and outputs/plot.ceac.all.png: CEAC table and plot derived from PSA</w:t>
+      </w:r>
+    </w:p>
+    <w:p>
+      <w:pPr>
+        <w:pStyle w:val="ListParagraph"/>
+        <w:numPr>
+          <w:ilvl w:val="0"/>
+          <w:numId w:val="36"/>
+        </w:numPr>
+        <w:spacing w:after="200" w:line="240" w:lineRule="auto"/>
+        <w:contextualSpacing w:val="0"/>
+        <w:divId w:val="860977169"/>
+      </w:pPr>
+      <w:r>
+        <w:rPr>
+          <w:rFonts w:eastAsia="Calibri" w:cs="Calibri"/>
+        </w:rPr>
+        <w:t>outputs/psa_summary.csv: PSA summary statistics (mean, 2.5th and 97.5th percentiles) for incremental costs, incremental QALYs, and NMB (from 4_scenario_analysis.R)</w:t>
+      </w:r>
+    </w:p>
+    <w:p>
+      <w:pPr>
+        <w:pStyle w:val="ListParagraph"/>
+        <w:numPr>
+          <w:ilvl w:val="0"/>
+          <w:numId w:val="35"/>
+        </w:numPr>
+        <w:spacing w:after="100" w:line="240" w:lineRule="auto"/>
+        <w:contextualSpacing w:val="0"/>
+        <w:divId w:val="860977169"/>
+      </w:pPr>
+      <w:r>
+        <w:rPr>
+          <w:rFonts w:eastAsia="Calibri" w:cs="Calibri"/>
+        </w:rPr>
+        <w:t>Manuscript tables (from 5_manuscript_tables.R):</w:t>
+      </w:r>
+    </w:p>
+    <w:p>
+      <w:pPr>
+        <w:pStyle w:val="ListParagraph"/>
+        <w:numPr>
+          <w:ilvl w:val="0"/>
+          <w:numId w:val="36"/>
+        </w:numPr>
+        <w:spacing w:after="60" w:line="240" w:lineRule="auto"/>
+        <w:contextualSpacing w:val="0"/>
+        <w:divId w:val="860977169"/>
+      </w:pPr>
+      <w:r>
+        <w:rPr>
+          <w:rFonts w:eastAsia="Calibri" w:cs="Calibri"/>
+        </w:rPr>
+        <w:t>outputs/table3_clean.csv: formatted Table 3 (national procedure volumes, costs saved, and QALYs by treatment type)</w:t>
+      </w:r>
+    </w:p>
+    <w:p>
+      <w:pPr>
+        <w:pStyle w:val="ListParagraph"/>
+        <w:numPr>
+          <w:ilvl w:val="0"/>
+          <w:numId w:val="36"/>
+        </w:numPr>
+        <w:spacing w:after="200" w:line="240" w:lineRule="auto"/>
+        <w:contextualSpacing w:val="0"/>
+        <w:divId w:val="860977169"/>
+      </w:pPr>
+      <w:r>
+        <w:rPr>
+          <w:rFonts w:eastAsia="Calibri" w:cs="Calibri"/>
+        </w:rPr>
+        <w:t>outputs/table4_clean.csv: formatted Table 4 (scenario analysis and PSA incremental results with NMB)</w:t>
+      </w:r>
+    </w:p>
+    <w:p>
+      <w:pPr>
+        <w:pStyle w:val="ListParagraph"/>
+        <w:numPr>
+          <w:ilvl w:val="0"/>
+          <w:numId w:val="35"/>
+        </w:numPr>
+        <w:spacing w:after="100" w:line="240" w:lineRule="auto"/>
+        <w:contextualSpacing w:val="0"/>
+        <w:divId w:val="860977169"/>
+      </w:pPr>
+      <w:r>
+        <w:rPr>
+          <w:rFonts w:eastAsia="Calibri" w:cs="Calibri"/>
+        </w:rPr>
+        <w:t>Created inputs (from 2_probabilistic_sampling.R):</w:t>
+      </w:r>
+    </w:p>
+    <w:p>
+      <w:pPr>
+        <w:pStyle w:val="ListParagraph"/>
+        <w:numPr>
+          <w:ilvl w:val="0"/>
+          <w:numId w:val="36"/>
+        </w:numPr>
+        <w:spacing w:after="200" w:line="240" w:lineRule="auto"/>
+        <w:contextualSpacing w:val="0"/>
+        <w:divId w:val="860977169"/>
+      </w:pPr>
+      <w:r>
+        <w:rPr>
+          <w:rFonts w:eastAsia="Calibri" w:cs="Calibri"/>
+        </w:rPr>
         <w:lastRenderedPageBreak/>
-        <w:t xml:space="preserve">  - </w:t>
-      </w:r>
-      <w:proofErr w:type="spellStart"/>
-      <w:r>
-        <w:t>incremental_results</w:t>
-      </w:r>
-      <w:proofErr w:type="spellEnd"/>
-      <w:r>
-        <w:t>: key incremental outcomes and Net Monetary Benefit (NMB)</w:t>
-      </w:r>
-      <w:r>
-        <w:br/>
-        <w:t xml:space="preserve">  - </w:t>
-      </w:r>
-      <w:proofErr w:type="spellStart"/>
-      <w:r>
-        <w:t>process_results</w:t>
-      </w:r>
-      <w:proofErr w:type="spellEnd"/>
-      <w:r>
-        <w:t>: pathway/process counts and component costs/QALYs</w:t>
-      </w:r>
-      <w:r>
-        <w:br/>
-        <w:t xml:space="preserve">  - </w:t>
-      </w:r>
-      <w:proofErr w:type="spellStart"/>
-      <w:r>
-        <w:t>mrs.trace</w:t>
-      </w:r>
-      <w:proofErr w:type="spellEnd"/>
-      <w:r>
-        <w:t>: Markov trace (mRS0–mRS6 over cycles)</w:t>
-      </w:r>
-      <w:r>
-        <w:br/>
-        <w:t xml:space="preserve">  - </w:t>
-      </w:r>
-      <w:proofErr w:type="spellStart"/>
-      <w:r>
-        <w:t>trace.standard</w:t>
-      </w:r>
-      <w:proofErr w:type="spellEnd"/>
-      <w:r>
-        <w:t xml:space="preserve"> / </w:t>
-      </w:r>
-      <w:proofErr w:type="spellStart"/>
-      <w:r>
-        <w:t>trace.intervention</w:t>
-      </w:r>
-      <w:proofErr w:type="spellEnd"/>
-      <w:r>
-        <w:t>: decision-tree traces</w:t>
-      </w:r>
-      <w:r>
-        <w:br/>
-        <w:t xml:space="preserve">  - </w:t>
-      </w:r>
-      <w:proofErr w:type="spellStart"/>
-      <w:r>
-        <w:t>tm.standard</w:t>
-      </w:r>
-      <w:proofErr w:type="spellEnd"/>
-      <w:r>
-        <w:t xml:space="preserve"> / </w:t>
-      </w:r>
-      <w:proofErr w:type="spellStart"/>
-      <w:r>
-        <w:t>tm.intervention</w:t>
-      </w:r>
-      <w:proofErr w:type="spellEnd"/>
-      <w:r>
-        <w:t>: transition arrays (per cycle)</w:t>
-      </w:r>
-      <w:r>
-        <w:br/>
-        <w:t>- Convenience CSVs: population_results.csv, NMB.csv, proc_results.csv, mrstrace_results.csv</w:t>
-      </w:r>
-    </w:p>
-    <w:p>
-      <w:pPr>
-        <w:spacing w:after="0"/>
-        <w:divId w:val="860977169"/>
-      </w:pPr>
-      <w:r>
-        <w:t xml:space="preserve">- </w:t>
-      </w:r>
-      <w:proofErr w:type="spellStart"/>
-      <w:r>
-        <w:t>DSA</w:t>
-      </w:r>
-      <w:r>
-        <w:t>_results</w:t>
-      </w:r>
-      <w:proofErr w:type="spellEnd"/>
-      <w:r>
-        <w:t>:</w:t>
-      </w:r>
-      <w:r>
-        <w:t xml:space="preserve"> results</w:t>
-      </w:r>
-      <w:r>
-        <w:t xml:space="preserve"> from the deterministic sensitivity analysis</w:t>
-      </w:r>
-    </w:p>
-    <w:p>
-      <w:pPr>
-        <w:divId w:val="860977169"/>
-        <w:rPr>
-          <w:lang w:val="it-IT"/>
-        </w:rPr>
-      </w:pPr>
-      <w:r>
-        <w:rPr>
-          <w:lang w:val="it-IT"/>
-        </w:rPr>
-        <w:t xml:space="preserve">- </w:t>
-      </w:r>
-      <w:r>
-        <w:rPr>
-          <w:lang w:val="it-IT"/>
-        </w:rPr>
-        <w:t xml:space="preserve">scenario_incremental_results.csv: </w:t>
-      </w:r>
-      <w:r>
-        <w:rPr>
-          <w:lang w:val="it-IT"/>
-        </w:rPr>
-        <w:t xml:space="preserve">Scenario results </w:t>
-      </w:r>
-    </w:p>
-    <w:p>
-      <w:pPr>
-        <w:pStyle w:val="ListBullet"/>
-        <w:tabs>
-          <w:tab w:val="num" w:pos="360"/>
-        </w:tabs>
-        <w:ind w:left="360" w:hanging="360"/>
-        <w:divId w:val="860977169"/>
-      </w:pPr>
-      <w:r>
-        <w:t>Regional &amp; local aggregation:</w:t>
-      </w:r>
-    </w:p>
-    <w:p>
-      <w:pPr>
-        <w:divId w:val="860977169"/>
-      </w:pPr>
-      <w:r>
-        <w:t>- outputs/</w:t>
-      </w:r>
-      <w:proofErr w:type="spellStart"/>
-      <w:r>
-        <w:t>network_results.RData</w:t>
-      </w:r>
-      <w:proofErr w:type="spellEnd"/>
-      <w:r>
-        <w:t xml:space="preserve"> (ISDN-level list of model results) and outputs/ISDN_incremental_results.csv</w:t>
-      </w:r>
-      <w:r>
-        <w:br/>
-        <w:t>- outputs/</w:t>
-      </w:r>
-      <w:proofErr w:type="spellStart"/>
-      <w:r>
-        <w:t>hospital_results.RData</w:t>
-      </w:r>
-      <w:proofErr w:type="spellEnd"/>
-      <w:r>
-        <w:t xml:space="preserve"> (hospital-level list of model results) and outputs/hospital_incremental_results.csv</w:t>
-      </w:r>
-    </w:p>
-    <w:p>
-      <w:pPr>
-        <w:pStyle w:val="ListBullet"/>
-        <w:tabs>
-          <w:tab w:val="num" w:pos="360"/>
-        </w:tabs>
-        <w:ind w:left="360" w:hanging="360"/>
-        <w:divId w:val="860977169"/>
-      </w:pPr>
-      <w:r>
-        <w:t>Probabilistic Sensitivity Analysis (PSA):</w:t>
-      </w:r>
-    </w:p>
-    <w:p>
-      <w:pPr>
-        <w:divId w:val="860977169"/>
-      </w:pPr>
-      <w:r>
-        <w:t>- outputs/psa_outputs.csv: per-simulation totals (costs/QALYs by arm) plus incremental values</w:t>
-      </w:r>
-      <w:r>
-        <w:br/>
-        <w:t>- outputs/CEAC.long.csv and outputs/plot.ceac.all.png: CEAC table and plot derived from PSA</w:t>
-      </w:r>
-    </w:p>
-    <w:p>
-      <w:pPr>
-        <w:pStyle w:val="ListBullet"/>
-        <w:tabs>
-          <w:tab w:val="num" w:pos="360"/>
-        </w:tabs>
-        <w:ind w:left="360" w:hanging="360"/>
-        <w:divId w:val="860977169"/>
-      </w:pPr>
-      <w:r>
+        <w:t>inputs/created_inputs/parameters_post_psa.csv: parameter file updated with fitted PSA distribution parameters (shape/rate for gamma, mu/sigma for log-normal, etc.). This is an intermediate file used by the model, not a final output.</w:t>
+      </w:r>
+    </w:p>
+    <w:p>
+      <w:pPr>
+        <w:pStyle w:val="ListParagraph"/>
+        <w:numPr>
+          <w:ilvl w:val="0"/>
+          <w:numId w:val="35"/>
+        </w:numPr>
+        <w:spacing w:after="100" w:line="240" w:lineRule="auto"/>
+        <w:contextualSpacing w:val="0"/>
+        <w:divId w:val="860977169"/>
+      </w:pPr>
+      <w:r>
+        <w:rPr>
+          <w:rFonts w:eastAsia="Calibri" w:cs="Calibri"/>
+          <w:b/>
+          <w:bCs/>
+        </w:rPr>
         <w:t>Figures (generated from figure scripts using the above files):</w:t>
       </w:r>
     </w:p>
     <w:p>
       <w:pPr>
-        <w:divId w:val="860977169"/>
-      </w:pPr>
-      <w:r>
-        <w:t>- CE plane: outputs/plot.ce.plane.png (incremental cost vs QALY)</w:t>
-      </w:r>
-      <w:r>
-        <w:br/>
-        <w:t>- CEAC: outputs/plot.ceac.all.png (probability cost-effective vs WTP)</w:t>
-      </w:r>
-      <w:r>
-        <w:br/>
-        <w:t>- mRS flow: outputs/mrs_plot.png</w:t>
-      </w:r>
-      <w:r>
-        <w:br/>
-        <w:t>- Pathway Sankey: outputs/standard_sankey_plot.html, outputs/intervention_sankey_plot.html</w:t>
-      </w:r>
-    </w:p>
-    <w:p>
-      <w:pPr>
-        <w:pStyle w:val="ListBullet"/>
-        <w:tabs>
-          <w:tab w:val="num" w:pos="360"/>
-        </w:tabs>
-        <w:ind w:left="360" w:hanging="360"/>
-        <w:divId w:val="860977169"/>
-      </w:pPr>
-      <w:r>
+        <w:pStyle w:val="ListParagraph"/>
+        <w:numPr>
+          <w:ilvl w:val="0"/>
+          <w:numId w:val="36"/>
+        </w:numPr>
+        <w:spacing w:after="60" w:line="240" w:lineRule="auto"/>
+        <w:contextualSpacing w:val="0"/>
+        <w:divId w:val="860977169"/>
+      </w:pPr>
+      <w:r>
+        <w:rPr>
+          <w:rFonts w:eastAsia="Calibri" w:cs="Calibri"/>
+        </w:rPr>
+        <w:t>CE plane: outputs/plot.ce.plane.png (incremental cost vs QALY)</w:t>
+      </w:r>
+    </w:p>
+    <w:p>
+      <w:pPr>
+        <w:pStyle w:val="ListParagraph"/>
+        <w:numPr>
+          <w:ilvl w:val="0"/>
+          <w:numId w:val="36"/>
+        </w:numPr>
+        <w:spacing w:after="60" w:line="240" w:lineRule="auto"/>
+        <w:contextualSpacing w:val="0"/>
+        <w:divId w:val="860977169"/>
+      </w:pPr>
+      <w:r>
+        <w:rPr>
+          <w:rFonts w:eastAsia="Calibri" w:cs="Calibri"/>
+        </w:rPr>
+        <w:t>CEAC: outputs/plot.ceac.all.png (probability cost-effective vs WTP)</w:t>
+      </w:r>
+    </w:p>
+    <w:p>
+      <w:pPr>
+        <w:pStyle w:val="ListParagraph"/>
+        <w:numPr>
+          <w:ilvl w:val="0"/>
+          <w:numId w:val="36"/>
+        </w:numPr>
+        <w:spacing w:after="60" w:line="240" w:lineRule="auto"/>
+        <w:contextualSpacing w:val="0"/>
+        <w:divId w:val="860977169"/>
+      </w:pPr>
+      <w:r>
+        <w:rPr>
+          <w:rFonts w:eastAsia="Calibri" w:cs="Calibri"/>
+        </w:rPr>
+        <w:t>DSA tornado: outputs/dsa_plot.png (one-way sensitivity analysis)</w:t>
+      </w:r>
+    </w:p>
+    <w:p>
+      <w:pPr>
+        <w:pStyle w:val="ListParagraph"/>
+        <w:numPr>
+          <w:ilvl w:val="0"/>
+          <w:numId w:val="36"/>
+        </w:numPr>
+        <w:spacing w:after="60" w:line="240" w:lineRule="auto"/>
+        <w:contextualSpacing w:val="0"/>
+        <w:divId w:val="860977169"/>
+      </w:pPr>
+      <w:r>
+        <w:rPr>
+          <w:rFonts w:eastAsia="Calibri" w:cs="Calibri"/>
+        </w:rPr>
+        <w:t>mRS flow: outputs/mrs_plot.png</w:t>
+      </w:r>
+    </w:p>
+    <w:p>
+      <w:pPr>
+        <w:pStyle w:val="ListParagraph"/>
+        <w:numPr>
+          <w:ilvl w:val="0"/>
+          <w:numId w:val="36"/>
+        </w:numPr>
+        <w:spacing w:after="200" w:line="240" w:lineRule="auto"/>
+        <w:contextualSpacing w:val="0"/>
+        <w:divId w:val="860977169"/>
+      </w:pPr>
+      <w:r>
+        <w:rPr>
+          <w:rFonts w:eastAsia="Calibri" w:cs="Calibri"/>
+        </w:rPr>
+        <w:t>Pathway Sankey: outputs/standard_sankey_plot.html, outputs/intervention_sankey_plot.html</w:t>
+      </w:r>
+    </w:p>
+    <w:p>
+      <w:pPr>
+        <w:pStyle w:val="ListParagraph"/>
+        <w:numPr>
+          <w:ilvl w:val="0"/>
+          <w:numId w:val="35"/>
+        </w:numPr>
+        <w:spacing w:after="100" w:line="240" w:lineRule="auto"/>
+        <w:contextualSpacing w:val="0"/>
+        <w:divId w:val="860977169"/>
+      </w:pPr>
+      <w:r>
+        <w:rPr>
+          <w:rFonts w:eastAsia="Calibri" w:cs="Calibri"/>
+          <w:b/>
+          <w:bCs/>
+        </w:rPr>
         <w:t>Report inputs:</w:t>
       </w:r>
     </w:p>
     <w:p>
       <w:pPr>
-        <w:divId w:val="860977169"/>
-      </w:pPr>
-      <w:r>
-        <w:t xml:space="preserve">- The </w:t>
-      </w:r>
-      <w:r>
-        <w:t>HTML</w:t>
-      </w:r>
-      <w:r>
-        <w:t xml:space="preserve"> report (</w:t>
-      </w:r>
-      <w:proofErr w:type="spellStart"/>
-      <w:r>
-        <w:t>Report_Creation.Rmd</w:t>
-      </w:r>
-      <w:proofErr w:type="spellEnd"/>
-      <w:r>
-        <w:t xml:space="preserve">) reads </w:t>
-      </w:r>
-      <w:proofErr w:type="spellStart"/>
-      <w:r>
-        <w:t>base_case_results.RData</w:t>
-      </w:r>
-      <w:proofErr w:type="spellEnd"/>
-      <w:r>
-        <w:t xml:space="preserve">, </w:t>
-      </w:r>
-      <w:proofErr w:type="spellStart"/>
-      <w:r>
-        <w:t>network_results.RData</w:t>
-      </w:r>
-      <w:proofErr w:type="spellEnd"/>
-      <w:r>
-        <w:t xml:space="preserve">, and </w:t>
-      </w:r>
-      <w:proofErr w:type="spellStart"/>
-      <w:r>
-        <w:t>hospital_results.RData</w:t>
-      </w:r>
-      <w:proofErr w:type="spellEnd"/>
-      <w:r>
-        <w:t>.</w:t>
+        <w:pStyle w:val="ListParagraph"/>
+        <w:numPr>
+          <w:ilvl w:val="0"/>
+          <w:numId w:val="36"/>
+        </w:numPr>
+        <w:spacing w:after="100" w:line="240" w:lineRule="auto"/>
+        <w:contextualSpacing w:val="0"/>
+        <w:divId w:val="860977169"/>
+      </w:pPr>
+      <w:r>
+        <w:rPr>
+          <w:rFonts w:eastAsia="Calibri" w:cs="Calibri"/>
+        </w:rPr>
+        <w:t>The HTML report (Report_Creation.Rmd) reads base_case_results.RData, network_results.RData, and hospital_results.RData.</w:t>
       </w:r>
     </w:p>
     <w:p>
@@ -6933,39 +6703,8 @@
           <w:sz w:val="22"/>
           <w:szCs w:val="21"/>
         </w:rPr>
-        <w:t xml:space="preserve">ΔQALY = </w:t>
-      </w:r>
-      <w:proofErr w:type="spellStart"/>
-      <w:r>
-        <w:rPr>
-          <w:rFonts w:asciiTheme="minorHAnsi" w:hAnsiTheme="minorHAnsi" w:cs="Segoe UI"/>
-          <w:color w:val="000000"/>
-          <w:sz w:val="22"/>
-          <w:szCs w:val="21"/>
-        </w:rPr>
-        <w:t>QALY_Intervention</w:t>
-      </w:r>
-      <w:proofErr w:type="spellEnd"/>
-      <w:r>
-        <w:rPr>
-          <w:rFonts w:asciiTheme="minorHAnsi" w:hAnsiTheme="minorHAnsi" w:cs="Segoe UI"/>
-          <w:color w:val="000000"/>
-          <w:sz w:val="22"/>
-          <w:szCs w:val="21"/>
-        </w:rPr>
-        <w:t xml:space="preserve"> − </w:t>
-      </w:r>
-      <w:proofErr w:type="spellStart"/>
-      <w:r>
-        <w:rPr>
-          <w:rFonts w:asciiTheme="minorHAnsi" w:hAnsiTheme="minorHAnsi" w:cs="Segoe UI"/>
-          <w:color w:val="000000"/>
-          <w:sz w:val="22"/>
-          <w:szCs w:val="21"/>
-        </w:rPr>
-        <w:t>QALY_Standard</w:t>
-      </w:r>
-      <w:proofErr w:type="spellEnd"/>
+        <w:t>ΔQALY = QALY_Intervention − QALY_Standard</w:t>
+      </w:r>
     </w:p>
     <w:p>
       <w:pPr>
@@ -6980,7 +6719,6 @@
           <w:szCs w:val="21"/>
         </w:rPr>
       </w:pPr>
-      <w:proofErr w:type="spellStart"/>
       <w:r>
         <w:rPr>
           <w:rFonts w:asciiTheme="minorHAnsi" w:hAnsiTheme="minorHAnsi" w:cs="Segoe UI"/>
@@ -6988,49 +6726,8 @@
           <w:sz w:val="22"/>
           <w:szCs w:val="21"/>
         </w:rPr>
-        <w:t>ΔCost</w:t>
-      </w:r>
-      <w:proofErr w:type="spellEnd"/>
-      <w:r>
-        <w:rPr>
-          <w:rFonts w:asciiTheme="minorHAnsi" w:hAnsiTheme="minorHAnsi" w:cs="Segoe UI"/>
-          <w:color w:val="000000"/>
-          <w:sz w:val="22"/>
-          <w:szCs w:val="21"/>
-        </w:rPr>
-        <w:t xml:space="preserve"> = </w:t>
-      </w:r>
-      <w:proofErr w:type="spellStart"/>
-      <w:r>
-        <w:rPr>
-          <w:rFonts w:asciiTheme="minorHAnsi" w:hAnsiTheme="minorHAnsi" w:cs="Segoe UI"/>
-          <w:color w:val="000000"/>
-          <w:sz w:val="22"/>
-          <w:szCs w:val="21"/>
-        </w:rPr>
-        <w:t>Cost_Intervention</w:t>
-      </w:r>
-      <w:proofErr w:type="spellEnd"/>
-      <w:r>
-        <w:rPr>
-          <w:rFonts w:asciiTheme="minorHAnsi" w:hAnsiTheme="minorHAnsi" w:cs="Segoe UI"/>
-          <w:color w:val="000000"/>
-          <w:sz w:val="22"/>
-          <w:szCs w:val="21"/>
-        </w:rPr>
-        <w:t xml:space="preserve"> − </w:t>
-      </w:r>
-      <w:proofErr w:type="spellStart"/>
-      <w:r>
-        <w:rPr>
-          <w:rFonts w:asciiTheme="minorHAnsi" w:hAnsiTheme="minorHAnsi" w:cs="Segoe UI"/>
-          <w:color w:val="000000"/>
-          <w:sz w:val="22"/>
-          <w:szCs w:val="21"/>
-        </w:rPr>
-        <w:t>Cost_Standard</w:t>
-      </w:r>
-      <w:proofErr w:type="spellEnd"/>
+        <w:t>ΔCost = Cost_Intervention − Cost_Standard</w:t>
+      </w:r>
     </w:p>
     <w:p>
       <w:pPr>
@@ -7052,27 +6749,7 @@
           <w:sz w:val="22"/>
           <w:szCs w:val="21"/>
         </w:rPr>
-        <w:t xml:space="preserve">Positive ΔQALY indicates health gain; negative </w:t>
-      </w:r>
-      <w:proofErr w:type="spellStart"/>
-      <w:r>
-        <w:rPr>
-          <w:rFonts w:asciiTheme="minorHAnsi" w:hAnsiTheme="minorHAnsi" w:cs="Segoe UI"/>
-          <w:color w:val="000000"/>
-          <w:sz w:val="22"/>
-          <w:szCs w:val="21"/>
-        </w:rPr>
-        <w:t>ΔCost</w:t>
-      </w:r>
-      <w:proofErr w:type="spellEnd"/>
-      <w:r>
-        <w:rPr>
-          <w:rFonts w:asciiTheme="minorHAnsi" w:hAnsiTheme="minorHAnsi" w:cs="Segoe UI"/>
-          <w:color w:val="000000"/>
-          <w:sz w:val="22"/>
-          <w:szCs w:val="21"/>
-        </w:rPr>
-        <w:t xml:space="preserve"> indicates cost savings.</w:t>
+        <w:t>Positive ΔQALY indicates health gain; negative ΔCost indicates cost savings.</w:t>
       </w:r>
     </w:p>
     <w:p>
@@ -7151,19 +6828,8 @@
           <w:sz w:val="22"/>
           <w:szCs w:val="21"/>
         </w:rPr>
-        <w:t xml:space="preserve">NMB = (ΔQALY × WTP) − </w:t>
-      </w:r>
-      <w:proofErr w:type="spellStart"/>
-      <w:r>
-        <w:rPr>
-          <w:rFonts w:asciiTheme="minorHAnsi" w:hAnsiTheme="minorHAnsi" w:cs="Segoe UI"/>
-          <w:color w:val="000000"/>
-          <w:sz w:val="22"/>
-          <w:szCs w:val="21"/>
-        </w:rPr>
-        <w:t>ΔCost</w:t>
-      </w:r>
-      <w:proofErr w:type="spellEnd"/>
+        <w:t>NMB = (ΔQALY × WTP) − ΔCost</w:t>
+      </w:r>
     </w:p>
     <w:p>
       <w:pPr>
@@ -7231,7 +6897,6 @@
           <w:sz w:val="22"/>
           <w:szCs w:val="21"/>
         </w:rPr>
-        <w:lastRenderedPageBreak/>
         <w:t>- NMB &lt; 0 → not cost-effective</w:t>
       </w:r>
     </w:p>
@@ -7306,27 +6971,7 @@
           <w:sz w:val="22"/>
           <w:szCs w:val="21"/>
         </w:rPr>
-        <w:t xml:space="preserve">- CE plane: each point is a PSA draw of (ΔQALY, </w:t>
-      </w:r>
-      <w:proofErr w:type="spellStart"/>
-      <w:r>
-        <w:rPr>
-          <w:rFonts w:asciiTheme="minorHAnsi" w:hAnsiTheme="minorHAnsi" w:cs="Segoe UI"/>
-          <w:color w:val="000000"/>
-          <w:sz w:val="22"/>
-          <w:szCs w:val="21"/>
-        </w:rPr>
-        <w:t>ΔCost</w:t>
-      </w:r>
-      <w:proofErr w:type="spellEnd"/>
-      <w:r>
-        <w:rPr>
-          <w:rFonts w:asciiTheme="minorHAnsi" w:hAnsiTheme="minorHAnsi" w:cs="Segoe UI"/>
-          <w:color w:val="000000"/>
-          <w:sz w:val="22"/>
-          <w:szCs w:val="21"/>
-        </w:rPr>
-        <w:t>); the line with slope = WTP (e.g., 20,000) separates cost-effective from not.</w:t>
+        <w:t>- CE plane: each point is a PSA draw of (ΔQALY, ΔCost); the line with slope = WTP (e.g., 20,000) separates cost-effective from not.</w:t>
       </w:r>
     </w:p>
     <w:p>
@@ -7432,23 +7077,8 @@
         <w:divId w:val="860977169"/>
       </w:pPr>
       <w:r>
-        <w:t>In “1_hospital_data_processing.R” it is hard-coded which year filter is used with “</w:t>
-      </w:r>
-      <w:proofErr w:type="spellStart"/>
-      <w:r>
-        <w:t>isdn</w:t>
-      </w:r>
-      <w:proofErr w:type="spellEnd"/>
-      <w:r>
-        <w:t xml:space="preserve"> &lt;- </w:t>
-      </w:r>
-      <w:proofErr w:type="spellStart"/>
-      <w:r>
-        <w:t>isdn</w:t>
-      </w:r>
-      <w:proofErr w:type="spellEnd"/>
-      <w:r>
-        <w:t>[date=="Apr 2022-Mar 2023"]” . If a later refresh lands, you’ll unknowingly drop newer data.</w:t>
+        <w:lastRenderedPageBreak/>
+        <w:t>In “1_hospital_data_processing.R” it is hard-coded which year filter is used with “isdn &lt;- isdn[date=="Apr 2022-Mar 2023"]” . If a later refresh lands, you’ll unknowingly drop newer data.</w:t>
       </w:r>
     </w:p>
     <w:p>
@@ -7472,6 +7102,29 @@
     </w:p>
     <w:p>
       <w:pPr>
+        <w:pStyle w:val="ListParagraph"/>
+        <w:numPr>
+          <w:ilvl w:val="0"/>
+          <w:numId w:val="4"/>
+        </w:numPr>
+        <w:divId w:val="860977169"/>
+      </w:pPr>
+      <w:r>
+        <w:t xml:space="preserve">5_manuscript_tables.R dependency: this script must be run </w:t>
+      </w:r>
+      <w:r>
+        <w:rPr>
+          <w:i/>
+          <w:iCs/>
+        </w:rPr>
+        <w:t>after</w:t>
+      </w:r>
+      <w:r>
+        <w:t xml:space="preserve"> 4_scenario_analysis.R (it requires scenario objects in memory). </w:t>
+      </w:r>
+    </w:p>
+    <w:p>
+      <w:pPr>
         <w:pStyle w:val="Heading3"/>
         <w:divId w:val="860977169"/>
       </w:pPr>
@@ -7498,7 +7151,6 @@
         <w:spacing w:after="0"/>
         <w:divId w:val="860977169"/>
       </w:pPr>
-      <w:proofErr w:type="spellStart"/>
       <w:r>
         <w:rPr>
           <w:b/>
@@ -7506,7 +7158,6 @@
         </w:rPr>
         <w:t>n.stroke</w:t>
       </w:r>
-      <w:proofErr w:type="spellEnd"/>
       <w:r>
         <w:t xml:space="preserve"> is a single non-negative integer.</w:t>
       </w:r>
@@ -7600,6 +7251,39 @@
       <w:r>
         <w:t xml:space="preserve"> are checked for row sums = 1 and for any out-of-range cell values.</w:t>
       </w:r>
+    </w:p>
+    <w:p>
+      <w:pPr>
+        <w:pStyle w:val="ListParagraph"/>
+        <w:numPr>
+          <w:ilvl w:val="0"/>
+          <w:numId w:val="4"/>
+        </w:numPr>
+        <w:divId w:val="860977169"/>
+      </w:pPr>
+      <w:r>
+        <w:rPr>
+          <w:b/>
+          <w:bCs/>
+        </w:rPr>
+        <w:t>6_model_testing.R</w:t>
+      </w:r>
+      <w:r>
+        <w:rPr>
+          <w:b/>
+          <w:bCs/>
+        </w:rPr>
+        <w:t>:</w:t>
+      </w:r>
+      <w:r>
+        <w:t xml:space="preserve"> implements some testing of parameters and model structure.</w:t>
+      </w:r>
+    </w:p>
+    <w:p>
+      <w:pPr>
+        <w:spacing w:after="0"/>
+        <w:divId w:val="860977169"/>
+      </w:pPr>
     </w:p>
     <w:p>
       <w:pPr>
@@ -8249,6 +7933,60 @@
     </w:lvl>
   </w:abstractNum>
   <w:abstractNum w:abstractNumId="5" w15:restartNumberingAfterBreak="0">
+    <w:nsid w:val="0D02417F"/>
+    <w:multiLevelType w:val="hybridMultilevel"/>
+    <w:tmpl w:val="C3564A14"/>
+    <w:lvl w:ilvl="0" w:tplc="4E183FA2">
+      <w:start w:val="1"/>
+      <w:numFmt w:val="bullet"/>
+      <w:lvlText w:val="-"/>
+      <w:lvlJc w:val="left"/>
+      <w:pPr>
+        <w:ind w:left="1080" w:hanging="360"/>
+      </w:pPr>
+    </w:lvl>
+    <w:lvl w:ilvl="1" w:tplc="9C5C02D4">
+      <w:numFmt w:val="decimal"/>
+      <w:lvlText w:val=""/>
+      <w:lvlJc w:val="left"/>
+    </w:lvl>
+    <w:lvl w:ilvl="2" w:tplc="D21E5C0A">
+      <w:numFmt w:val="decimal"/>
+      <w:lvlText w:val=""/>
+      <w:lvlJc w:val="left"/>
+    </w:lvl>
+    <w:lvl w:ilvl="3" w:tplc="481CD68C">
+      <w:numFmt w:val="decimal"/>
+      <w:lvlText w:val=""/>
+      <w:lvlJc w:val="left"/>
+    </w:lvl>
+    <w:lvl w:ilvl="4" w:tplc="5DA872B2">
+      <w:numFmt w:val="decimal"/>
+      <w:lvlText w:val=""/>
+      <w:lvlJc w:val="left"/>
+    </w:lvl>
+    <w:lvl w:ilvl="5" w:tplc="7E7CE20E">
+      <w:numFmt w:val="decimal"/>
+      <w:lvlText w:val=""/>
+      <w:lvlJc w:val="left"/>
+    </w:lvl>
+    <w:lvl w:ilvl="6" w:tplc="B0CE58E2">
+      <w:numFmt w:val="decimal"/>
+      <w:lvlText w:val=""/>
+      <w:lvlJc w:val="left"/>
+    </w:lvl>
+    <w:lvl w:ilvl="7" w:tplc="3E245490">
+      <w:numFmt w:val="decimal"/>
+      <w:lvlText w:val=""/>
+      <w:lvlJc w:val="left"/>
+    </w:lvl>
+    <w:lvl w:ilvl="8" w:tplc="764CA550">
+      <w:numFmt w:val="decimal"/>
+      <w:lvlText w:val=""/>
+      <w:lvlJc w:val="left"/>
+    </w:lvl>
+  </w:abstractNum>
+  <w:abstractNum w:abstractNumId="6" w15:restartNumberingAfterBreak="0">
     <w:nsid w:val="127F3722"/>
     <w:multiLevelType w:val="multilevel"/>
     <w:tmpl w:val="C3CA9BE6"/>
@@ -8361,7 +8099,7 @@
       </w:pPr>
     </w:lvl>
   </w:abstractNum>
-  <w:abstractNum w:abstractNumId="6" w15:restartNumberingAfterBreak="0">
+  <w:abstractNum w:abstractNumId="7" w15:restartNumberingAfterBreak="0">
     <w:nsid w:val="164D2EC9"/>
     <w:multiLevelType w:val="hybridMultilevel"/>
     <w:tmpl w:val="4370A4F8"/>
@@ -8474,7 +8212,7 @@
       </w:rPr>
     </w:lvl>
   </w:abstractNum>
-  <w:abstractNum w:abstractNumId="7" w15:restartNumberingAfterBreak="0">
+  <w:abstractNum w:abstractNumId="8" w15:restartNumberingAfterBreak="0">
     <w:nsid w:val="21FB3FE9"/>
     <w:multiLevelType w:val="multilevel"/>
     <w:tmpl w:val="100AB090"/>
@@ -8623,7 +8361,7 @@
       </w:rPr>
     </w:lvl>
   </w:abstractNum>
-  <w:abstractNum w:abstractNumId="8" w15:restartNumberingAfterBreak="0">
+  <w:abstractNum w:abstractNumId="9" w15:restartNumberingAfterBreak="0">
     <w:nsid w:val="22A30C9B"/>
     <w:multiLevelType w:val="hybridMultilevel"/>
     <w:tmpl w:val="1E88ABD4"/>
@@ -8712,7 +8450,7 @@
       </w:pPr>
     </w:lvl>
   </w:abstractNum>
-  <w:abstractNum w:abstractNumId="9" w15:restartNumberingAfterBreak="0">
+  <w:abstractNum w:abstractNumId="10" w15:restartNumberingAfterBreak="0">
     <w:nsid w:val="23245E55"/>
     <w:multiLevelType w:val="multilevel"/>
     <w:tmpl w:val="4F90C1C0"/>
@@ -8861,7 +8599,7 @@
       </w:rPr>
     </w:lvl>
   </w:abstractNum>
-  <w:abstractNum w:abstractNumId="10" w15:restartNumberingAfterBreak="0">
+  <w:abstractNum w:abstractNumId="11" w15:restartNumberingAfterBreak="0">
     <w:nsid w:val="25432646"/>
     <w:multiLevelType w:val="hybridMultilevel"/>
     <w:tmpl w:val="B3541478"/>
@@ -8974,7 +8712,7 @@
       </w:rPr>
     </w:lvl>
   </w:abstractNum>
-  <w:abstractNum w:abstractNumId="11" w15:restartNumberingAfterBreak="0">
+  <w:abstractNum w:abstractNumId="12" w15:restartNumberingAfterBreak="0">
     <w:nsid w:val="2F4E77C7"/>
     <w:multiLevelType w:val="hybridMultilevel"/>
     <w:tmpl w:val="B24E090E"/>
@@ -9086,7 +8824,7 @@
       </w:rPr>
     </w:lvl>
   </w:abstractNum>
-  <w:abstractNum w:abstractNumId="12" w15:restartNumberingAfterBreak="0">
+  <w:abstractNum w:abstractNumId="13" w15:restartNumberingAfterBreak="0">
     <w:nsid w:val="304B6ACB"/>
     <w:multiLevelType w:val="hybridMultilevel"/>
     <w:tmpl w:val="746268B6"/>
@@ -9199,7 +8937,7 @@
       </w:rPr>
     </w:lvl>
   </w:abstractNum>
-  <w:abstractNum w:abstractNumId="13" w15:restartNumberingAfterBreak="0">
+  <w:abstractNum w:abstractNumId="14" w15:restartNumberingAfterBreak="0">
     <w:nsid w:val="333C50BA"/>
     <w:multiLevelType w:val="multilevel"/>
     <w:tmpl w:val="4A8AF8D2"/>
@@ -9348,7 +9086,7 @@
       </w:rPr>
     </w:lvl>
   </w:abstractNum>
-  <w:abstractNum w:abstractNumId="14" w15:restartNumberingAfterBreak="0">
+  <w:abstractNum w:abstractNumId="15" w15:restartNumberingAfterBreak="0">
     <w:nsid w:val="377D7F59"/>
     <w:multiLevelType w:val="multilevel"/>
     <w:tmpl w:val="A8F8E1EC"/>
@@ -9497,7 +9235,7 @@
       </w:rPr>
     </w:lvl>
   </w:abstractNum>
-  <w:abstractNum w:abstractNumId="15" w15:restartNumberingAfterBreak="0">
+  <w:abstractNum w:abstractNumId="16" w15:restartNumberingAfterBreak="0">
     <w:nsid w:val="38CB6FE1"/>
     <w:multiLevelType w:val="multilevel"/>
     <w:tmpl w:val="AD1C85A6"/>
@@ -9646,7 +9384,7 @@
       </w:rPr>
     </w:lvl>
   </w:abstractNum>
-  <w:abstractNum w:abstractNumId="16" w15:restartNumberingAfterBreak="0">
+  <w:abstractNum w:abstractNumId="17" w15:restartNumberingAfterBreak="0">
     <w:nsid w:val="392A4383"/>
     <w:multiLevelType w:val="multilevel"/>
     <w:tmpl w:val="63AE91A6"/>
@@ -9795,7 +9533,7 @@
       </w:rPr>
     </w:lvl>
   </w:abstractNum>
-  <w:abstractNum w:abstractNumId="17" w15:restartNumberingAfterBreak="0">
+  <w:abstractNum w:abstractNumId="18" w15:restartNumberingAfterBreak="0">
     <w:nsid w:val="439E4794"/>
     <w:multiLevelType w:val="hybridMultilevel"/>
     <w:tmpl w:val="A7B2DB5A"/>
@@ -9884,7 +9622,7 @@
       </w:pPr>
     </w:lvl>
   </w:abstractNum>
-  <w:abstractNum w:abstractNumId="18" w15:restartNumberingAfterBreak="0">
+  <w:abstractNum w:abstractNumId="19" w15:restartNumberingAfterBreak="0">
     <w:nsid w:val="48330D99"/>
     <w:multiLevelType w:val="hybridMultilevel"/>
     <w:tmpl w:val="D328524A"/>
@@ -9996,7 +9734,7 @@
       </w:rPr>
     </w:lvl>
   </w:abstractNum>
-  <w:abstractNum w:abstractNumId="19" w15:restartNumberingAfterBreak="0">
+  <w:abstractNum w:abstractNumId="20" w15:restartNumberingAfterBreak="0">
     <w:nsid w:val="485A6497"/>
     <w:multiLevelType w:val="multilevel"/>
     <w:tmpl w:val="A094C73E"/>
@@ -10145,7 +9883,7 @@
       </w:rPr>
     </w:lvl>
   </w:abstractNum>
-  <w:abstractNum w:abstractNumId="20" w15:restartNumberingAfterBreak="0">
+  <w:abstractNum w:abstractNumId="21" w15:restartNumberingAfterBreak="0">
     <w:nsid w:val="4AC35A64"/>
     <w:multiLevelType w:val="multilevel"/>
     <w:tmpl w:val="CB668B68"/>
@@ -10294,7 +10032,7 @@
       </w:rPr>
     </w:lvl>
   </w:abstractNum>
-  <w:abstractNum w:abstractNumId="21" w15:restartNumberingAfterBreak="0">
+  <w:abstractNum w:abstractNumId="22" w15:restartNumberingAfterBreak="0">
     <w:nsid w:val="52183298"/>
     <w:multiLevelType w:val="multilevel"/>
     <w:tmpl w:val="0809001D"/>
@@ -10407,7 +10145,7 @@
       </w:rPr>
     </w:lvl>
   </w:abstractNum>
-  <w:abstractNum w:abstractNumId="22" w15:restartNumberingAfterBreak="0">
+  <w:abstractNum w:abstractNumId="23" w15:restartNumberingAfterBreak="0">
     <w:nsid w:val="58005234"/>
     <w:multiLevelType w:val="hybridMultilevel"/>
     <w:tmpl w:val="CF7C3C5E"/>
@@ -10520,7 +10258,7 @@
       </w:rPr>
     </w:lvl>
   </w:abstractNum>
-  <w:abstractNum w:abstractNumId="23" w15:restartNumberingAfterBreak="0">
+  <w:abstractNum w:abstractNumId="24" w15:restartNumberingAfterBreak="0">
     <w:nsid w:val="5F312350"/>
     <w:multiLevelType w:val="multilevel"/>
     <w:tmpl w:val="E4BA5490"/>
@@ -10669,7 +10407,7 @@
       </w:rPr>
     </w:lvl>
   </w:abstractNum>
-  <w:abstractNum w:abstractNumId="24" w15:restartNumberingAfterBreak="0">
+  <w:abstractNum w:abstractNumId="25" w15:restartNumberingAfterBreak="0">
     <w:nsid w:val="65581FBC"/>
     <w:multiLevelType w:val="hybridMultilevel"/>
     <w:tmpl w:val="7CB21964"/>
@@ -10758,7 +10496,7 @@
       </w:pPr>
     </w:lvl>
   </w:abstractNum>
-  <w:abstractNum w:abstractNumId="25" w15:restartNumberingAfterBreak="0">
+  <w:abstractNum w:abstractNumId="26" w15:restartNumberingAfterBreak="0">
     <w:nsid w:val="6BB26A40"/>
     <w:multiLevelType w:val="multilevel"/>
     <w:tmpl w:val="BBF645F2"/>
@@ -10907,7 +10645,7 @@
       </w:rPr>
     </w:lvl>
   </w:abstractNum>
-  <w:abstractNum w:abstractNumId="26" w15:restartNumberingAfterBreak="0">
+  <w:abstractNum w:abstractNumId="27" w15:restartNumberingAfterBreak="0">
     <w:nsid w:val="6EE521CE"/>
     <w:multiLevelType w:val="multilevel"/>
     <w:tmpl w:val="138C27BC"/>
@@ -11052,7 +10790,7 @@
       </w:rPr>
     </w:lvl>
   </w:abstractNum>
-  <w:abstractNum w:abstractNumId="27" w15:restartNumberingAfterBreak="0">
+  <w:abstractNum w:abstractNumId="28" w15:restartNumberingAfterBreak="0">
     <w:nsid w:val="71756D62"/>
     <w:multiLevelType w:val="hybridMultilevel"/>
     <w:tmpl w:val="45F63CA0"/>
@@ -11165,7 +10903,7 @@
       </w:rPr>
     </w:lvl>
   </w:abstractNum>
-  <w:abstractNum w:abstractNumId="28" w15:restartNumberingAfterBreak="0">
+  <w:abstractNum w:abstractNumId="29" w15:restartNumberingAfterBreak="0">
     <w:nsid w:val="771124D8"/>
     <w:multiLevelType w:val="multilevel"/>
     <w:tmpl w:val="37E002F2"/>
@@ -11314,7 +11052,7 @@
       </w:rPr>
     </w:lvl>
   </w:abstractNum>
-  <w:abstractNum w:abstractNumId="29" w15:restartNumberingAfterBreak="0">
+  <w:abstractNum w:abstractNumId="30" w15:restartNumberingAfterBreak="0">
     <w:nsid w:val="77345355"/>
     <w:multiLevelType w:val="hybridMultilevel"/>
     <w:tmpl w:val="44A4BB7C"/>
@@ -11427,7 +11165,61 @@
       </w:rPr>
     </w:lvl>
   </w:abstractNum>
-  <w:abstractNum w:abstractNumId="30" w15:restartNumberingAfterBreak="0">
+  <w:abstractNum w:abstractNumId="31" w15:restartNumberingAfterBreak="0">
+    <w:nsid w:val="79C54C01"/>
+    <w:multiLevelType w:val="hybridMultilevel"/>
+    <w:tmpl w:val="2B220E58"/>
+    <w:lvl w:ilvl="0" w:tplc="8AAA1C36">
+      <w:start w:val="1"/>
+      <w:numFmt w:val="bullet"/>
+      <w:lvlText w:val="•"/>
+      <w:lvlJc w:val="left"/>
+      <w:pPr>
+        <w:ind w:left="720" w:hanging="360"/>
+      </w:pPr>
+    </w:lvl>
+    <w:lvl w:ilvl="1" w:tplc="C8CE2934">
+      <w:numFmt w:val="decimal"/>
+      <w:lvlText w:val=""/>
+      <w:lvlJc w:val="left"/>
+    </w:lvl>
+    <w:lvl w:ilvl="2" w:tplc="2D16181E">
+      <w:numFmt w:val="decimal"/>
+      <w:lvlText w:val=""/>
+      <w:lvlJc w:val="left"/>
+    </w:lvl>
+    <w:lvl w:ilvl="3" w:tplc="8E306FFC">
+      <w:numFmt w:val="decimal"/>
+      <w:lvlText w:val=""/>
+      <w:lvlJc w:val="left"/>
+    </w:lvl>
+    <w:lvl w:ilvl="4" w:tplc="73CA7C2A">
+      <w:numFmt w:val="decimal"/>
+      <w:lvlText w:val=""/>
+      <w:lvlJc w:val="left"/>
+    </w:lvl>
+    <w:lvl w:ilvl="5" w:tplc="F34AEDD8">
+      <w:numFmt w:val="decimal"/>
+      <w:lvlText w:val=""/>
+      <w:lvlJc w:val="left"/>
+    </w:lvl>
+    <w:lvl w:ilvl="6" w:tplc="22FC62EA">
+      <w:numFmt w:val="decimal"/>
+      <w:lvlText w:val=""/>
+      <w:lvlJc w:val="left"/>
+    </w:lvl>
+    <w:lvl w:ilvl="7" w:tplc="1D6AD458">
+      <w:numFmt w:val="decimal"/>
+      <w:lvlText w:val=""/>
+      <w:lvlJc w:val="left"/>
+    </w:lvl>
+    <w:lvl w:ilvl="8" w:tplc="C16CBE7E">
+      <w:numFmt w:val="decimal"/>
+      <w:lvlText w:val=""/>
+      <w:lvlJc w:val="left"/>
+    </w:lvl>
+  </w:abstractNum>
+  <w:abstractNum w:abstractNumId="32" w15:restartNumberingAfterBreak="0">
     <w:nsid w:val="7A531A16"/>
     <w:multiLevelType w:val="multilevel"/>
     <w:tmpl w:val="D7EE66DE"/>
@@ -11540,7 +11332,7 @@
       </w:pPr>
     </w:lvl>
   </w:abstractNum>
-  <w:abstractNum w:abstractNumId="31" w15:restartNumberingAfterBreak="0">
+  <w:abstractNum w:abstractNumId="33" w15:restartNumberingAfterBreak="0">
     <w:nsid w:val="7DA8578A"/>
     <w:multiLevelType w:val="hybridMultilevel"/>
     <w:tmpl w:val="5398475A"/>
@@ -11629,7 +11421,7 @@
       </w:pPr>
     </w:lvl>
   </w:abstractNum>
-  <w:abstractNum w:abstractNumId="32" w15:restartNumberingAfterBreak="0">
+  <w:abstractNum w:abstractNumId="34" w15:restartNumberingAfterBreak="0">
     <w:nsid w:val="7E1E0AA6"/>
     <w:multiLevelType w:val="hybridMultilevel"/>
     <w:tmpl w:val="694E71E2"/>
@@ -11742,7 +11534,7 @@
       </w:rPr>
     </w:lvl>
   </w:abstractNum>
-  <w:abstractNum w:abstractNumId="33" w15:restartNumberingAfterBreak="0">
+  <w:abstractNum w:abstractNumId="35" w15:restartNumberingAfterBreak="0">
     <w:nsid w:val="7E8B626F"/>
     <w:multiLevelType w:val="hybridMultilevel"/>
     <w:tmpl w:val="F564B32E"/>
@@ -11856,106 +11648,118 @@
     </w:lvl>
   </w:abstractNum>
   <w:num w:numId="1" w16cid:durableId="251862650">
-    <w:abstractNumId w:val="18"/>
+    <w:abstractNumId w:val="19"/>
   </w:num>
   <w:num w:numId="2" w16cid:durableId="1884756307">
-    <w:abstractNumId w:val="11"/>
+    <w:abstractNumId w:val="12"/>
   </w:num>
   <w:num w:numId="3" w16cid:durableId="1776248017">
+    <w:abstractNumId w:val="32"/>
+  </w:num>
+  <w:num w:numId="4" w16cid:durableId="482816276">
+    <w:abstractNumId w:val="35"/>
+  </w:num>
+  <w:num w:numId="5" w16cid:durableId="155145954">
     <w:abstractNumId w:val="30"/>
   </w:num>
-  <w:num w:numId="4" w16cid:durableId="482816276">
-    <w:abstractNumId w:val="33"/>
-  </w:num>
-  <w:num w:numId="5" w16cid:durableId="155145954">
-    <w:abstractNumId w:val="29"/>
-  </w:num>
   <w:num w:numId="6" w16cid:durableId="1052266261">
-    <w:abstractNumId w:val="20"/>
+    <w:abstractNumId w:val="21"/>
   </w:num>
   <w:num w:numId="7" w16cid:durableId="870344199">
-    <w:abstractNumId w:val="22"/>
+    <w:abstractNumId w:val="23"/>
   </w:num>
   <w:num w:numId="8" w16cid:durableId="266429004">
     <w:abstractNumId w:val="4"/>
   </w:num>
   <w:num w:numId="9" w16cid:durableId="1880972541">
+    <w:abstractNumId w:val="7"/>
+  </w:num>
+  <w:num w:numId="10" w16cid:durableId="183251172">
+    <w:abstractNumId w:val="11"/>
+  </w:num>
+  <w:num w:numId="11" w16cid:durableId="940067655">
+    <w:abstractNumId w:val="13"/>
+  </w:num>
+  <w:num w:numId="12" w16cid:durableId="688482620">
+    <w:abstractNumId w:val="28"/>
+  </w:num>
+  <w:num w:numId="13" w16cid:durableId="71390291">
+    <w:abstractNumId w:val="8"/>
+  </w:num>
+  <w:num w:numId="14" w16cid:durableId="449446077">
+    <w:abstractNumId w:val="17"/>
+  </w:num>
+  <w:num w:numId="15" w16cid:durableId="505092977">
     <w:abstractNumId w:val="6"/>
   </w:num>
-  <w:num w:numId="10" w16cid:durableId="183251172">
-    <w:abstractNumId w:val="10"/>
+  <w:num w:numId="16" w16cid:durableId="1632594635">
+    <w:abstractNumId w:val="26"/>
   </w:num>
-  <w:num w:numId="11" w16cid:durableId="940067655">
-    <w:abstractNumId w:val="12"/>
-  </w:num>
-  <w:num w:numId="12" w16cid:durableId="688482620">
+  <w:num w:numId="17" w16cid:durableId="1901359973">
     <w:abstractNumId w:val="27"/>
   </w:num>
-  <w:num w:numId="13" w16cid:durableId="71390291">
-    <w:abstractNumId w:val="7"/>
-  </w:num>
-  <w:num w:numId="14" w16cid:durableId="449446077">
-    <w:abstractNumId w:val="16"/>
-  </w:num>
-  <w:num w:numId="15" w16cid:durableId="505092977">
-    <w:abstractNumId w:val="5"/>
-  </w:num>
-  <w:num w:numId="16" w16cid:durableId="1632594635">
-    <w:abstractNumId w:val="25"/>
-  </w:num>
-  <w:num w:numId="17" w16cid:durableId="1901359973">
-    <w:abstractNumId w:val="26"/>
-  </w:num>
   <w:num w:numId="18" w16cid:durableId="601492022">
-    <w:abstractNumId w:val="19"/>
+    <w:abstractNumId w:val="20"/>
   </w:num>
   <w:num w:numId="19" w16cid:durableId="445274596">
-    <w:abstractNumId w:val="28"/>
+    <w:abstractNumId w:val="29"/>
   </w:num>
   <w:num w:numId="20" w16cid:durableId="1670207604">
-    <w:abstractNumId w:val="14"/>
+    <w:abstractNumId w:val="15"/>
   </w:num>
   <w:num w:numId="21" w16cid:durableId="1261723330">
-    <w:abstractNumId w:val="9"/>
+    <w:abstractNumId w:val="10"/>
   </w:num>
   <w:num w:numId="22" w16cid:durableId="689651176">
     <w:abstractNumId w:val="1"/>
   </w:num>
   <w:num w:numId="23" w16cid:durableId="1269115892">
-    <w:abstractNumId w:val="15"/>
+    <w:abstractNumId w:val="16"/>
   </w:num>
   <w:num w:numId="24" w16cid:durableId="1270120364">
-    <w:abstractNumId w:val="23"/>
+    <w:abstractNumId w:val="24"/>
   </w:num>
   <w:num w:numId="25" w16cid:durableId="115177843">
     <w:abstractNumId w:val="2"/>
   </w:num>
   <w:num w:numId="26" w16cid:durableId="472256535">
-    <w:abstractNumId w:val="13"/>
+    <w:abstractNumId w:val="14"/>
   </w:num>
   <w:num w:numId="27" w16cid:durableId="349180417">
-    <w:abstractNumId w:val="8"/>
+    <w:abstractNumId w:val="9"/>
   </w:num>
   <w:num w:numId="28" w16cid:durableId="828865370">
     <w:abstractNumId w:val="3"/>
   </w:num>
   <w:num w:numId="29" w16cid:durableId="1705404519">
-    <w:abstractNumId w:val="17"/>
+    <w:abstractNumId w:val="18"/>
   </w:num>
   <w:num w:numId="30" w16cid:durableId="864174416">
-    <w:abstractNumId w:val="21"/>
+    <w:abstractNumId w:val="22"/>
   </w:num>
   <w:num w:numId="31" w16cid:durableId="476849340">
-    <w:abstractNumId w:val="32"/>
+    <w:abstractNumId w:val="34"/>
   </w:num>
   <w:num w:numId="32" w16cid:durableId="700742368">
-    <w:abstractNumId w:val="24"/>
+    <w:abstractNumId w:val="25"/>
   </w:num>
   <w:num w:numId="33" w16cid:durableId="1078097945">
-    <w:abstractNumId w:val="31"/>
+    <w:abstractNumId w:val="33"/>
   </w:num>
   <w:num w:numId="34" w16cid:durableId="851258038">
     <w:abstractNumId w:val="0"/>
+  </w:num>
+  <w:num w:numId="35" w16cid:durableId="168256365">
+    <w:abstractNumId w:val="31"/>
+    <w:lvlOverride w:ilvl="0">
+      <w:startOverride w:val="1"/>
+    </w:lvlOverride>
+  </w:num>
+  <w:num w:numId="36" w16cid:durableId="873275530">
+    <w:abstractNumId w:val="5"/>
+    <w:lvlOverride w:ilvl="0">
+      <w:startOverride w:val="1"/>
+    </w:lvlOverride>
   </w:num>
 </w:numbering>
 </file>
@@ -12159,7 +11963,7 @@
     <w:lsdException w:name="Medium Shading 2 Accent 1" w:uiPriority="64"/>
     <w:lsdException w:name="Medium List 1 Accent 1" w:uiPriority="65"/>
     <w:lsdException w:name="Revision" w:semiHidden="1"/>
-    <w:lsdException w:name="List Paragraph" w:uiPriority="34" w:qFormat="1"/>
+    <w:lsdException w:name="List Paragraph" w:uiPriority="0" w:qFormat="1"/>
     <w:lsdException w:name="Quote" w:uiPriority="29" w:qFormat="1"/>
     <w:lsdException w:name="Intense Quote" w:uiPriority="30" w:qFormat="1"/>
     <w:lsdException w:name="Medium List 2 Accent 1" w:uiPriority="66"/>
@@ -12804,7 +12608,6 @@
   <w:style w:type="paragraph" w:styleId="ListParagraph">
     <w:name w:val="List Paragraph"/>
     <w:basedOn w:val="Normal"/>
-    <w:uiPriority w:val="34"/>
     <w:qFormat/>
     <w:rsid w:val="005565BB"/>
     <w:pPr>

</xml_diff>